<commit_message>
docs: correct ER relationships and diagram layout
</commit_message>
<xml_diff>
--- a/docs/组长241548153_谭卓谦_作业01_重绘图版.docx
+++ b/docs/组长241548153_谭卓谦_作业01_重绘图版.docx
@@ -2043,53 +2043,54 @@
                 <w:b w:val="0"/>
                 <w:sz w:val="21"/>
               </w:rPr>
-              <w:t>数据库整体</w:t>
-            </w:r>
-            <w:r>
-              <w:rPr>
-                <w:rFonts w:ascii="宋体" w:hAnsi="宋体" w:eastAsia="宋体"/>
-                <w:b w:val="0"/>
-                <w:sz w:val="21"/>
-              </w:rPr>
-              <w:t>E-R</w:t>
-            </w:r>
-            <w:r>
-              <w:rPr>
-                <w:rFonts w:ascii="宋体" w:hAnsi="宋体"/>
-                <w:b w:val="0"/>
-                <w:sz w:val="21"/>
-              </w:rPr>
-              <w:t>图如下。图中只绘制实体、联系和基数，字段详情见关系模式与</w:t>
-            </w:r>
-            <w:r>
-              <w:rPr>
-                <w:rFonts w:ascii="宋体" w:hAnsi="宋体" w:eastAsia="宋体"/>
-                <w:b w:val="0"/>
-                <w:sz w:val="21"/>
-              </w:rPr>
-              <w:t>SQL</w:t>
-            </w:r>
-            <w:r>
-              <w:rPr>
-                <w:rFonts w:ascii="宋体" w:hAnsi="宋体"/>
-                <w:b w:val="0"/>
-                <w:sz w:val="21"/>
-              </w:rPr>
-              <w:t>脚本。</w:t>
-            </w:r>
-          </w:p>
-          <w:p>
-            <w:pPr>
-              <w:spacing w:before="0" w:after="0"/>
+              <w:t>整体E-R图按模块分幅展示，同名实体表示同一张表。矩形为实体，菱形为联系；N表示多条，0..1表示可无且最多一条。审核、登记等操作人外键见关系模式和SQL。</w:t>
+            </w:r>
+            <w:r>
+              <w:rPr>
+                <w:rFonts w:ascii="宋体" w:hAnsi="宋体" w:eastAsia="宋体"/>
+                <w:b w:val="0"/>
+                <w:sz w:val="21"/>
+              </w:rPr>
+              <w:t/>
+            </w:r>
+            <w:r>
+              <w:rPr>
+                <w:rFonts w:ascii="宋体" w:hAnsi="宋体"/>
+                <w:b w:val="0"/>
+                <w:sz w:val="21"/>
+              </w:rPr>
+              <w:t/>
+            </w:r>
+            <w:r>
+              <w:rPr>
+                <w:rFonts w:ascii="宋体" w:hAnsi="宋体" w:eastAsia="宋体"/>
+                <w:b w:val="0"/>
+                <w:sz w:val="21"/>
+              </w:rPr>
+              <w:t/>
+            </w:r>
+            <w:r>
+              <w:rPr>
+                <w:rFonts w:ascii="宋体" w:hAnsi="宋体"/>
+                <w:b w:val="0"/>
+                <w:sz w:val="21"/>
+              </w:rPr>
+              <w:t/>
+            </w:r>
+          </w:p>
+          <w:p>
+            <w:pPr>
+              <w:keepLines/>
+              <w:spacing w:before="100" w:after="100" w:line="240" w:lineRule="auto"/>
               <w:jc w:val="center"/>
             </w:pPr>
             <w:bookmarkStart w:id="0" w:name="_GoBack"/>
             <w:r>
               <w:drawing>
                 <wp:inline distT="0" distB="0" distL="0" distR="0">
-                  <wp:extent cx="4920615" cy="3244921"/>
+                  <wp:extent cx="4920615" cy="3139013"/>
                   <wp:effectExtent l="0" t="0" r="0" b="0"/>
-                  <wp:docPr id="2" name="Picture 4"/>
+                  <wp:docPr id="201" name="E-R图：权限与人员" descr="实体、联系与基数；按当前SQL的外键和唯一约束绘制。"/>
                   <wp:cNvGraphicFramePr>
                     <a:graphicFrameLocks xmlns:a="http://schemas.openxmlformats.org/drawingml/2006/main" noChangeAspect="1"/>
                   </wp:cNvGraphicFramePr>
@@ -2097,13 +2098,13 @@
                     <a:graphicData uri="http://schemas.openxmlformats.org/drawingml/2006/picture">
                       <pic:pic xmlns:pic="http://schemas.openxmlformats.org/drawingml/2006/picture">
                         <pic:nvPicPr>
-                          <pic:cNvPr id="2" name="Picture 4"/>
+                          <pic:cNvPr id="201" name="E-R图：权限与人员" descr="实体、联系与基数；按当前SQL的外键和唯一约束绘制。"/>
                           <pic:cNvPicPr>
                             <a:picLocks noChangeAspect="1" noChangeArrowheads="1"/>
                           </pic:cNvPicPr>
                         </pic:nvPicPr>
                         <pic:blipFill>
-                          <a:blip r:embed="rId8"/>
+                          <a:blip r:embed="rIdErCorrected1"/>
                           <a:stretch>
                             <a:fillRect/>
                           </a:stretch>
@@ -2111,7 +2112,203 @@
                         <pic:spPr>
                           <a:xfrm>
                             <a:off x="0" y="0"/>
-                            <a:ext cx="4920615" cy="3244921"/>
+                            <a:ext cx="4920615" cy="3139013"/>
+                          </a:xfrm>
+                          <a:prstGeom prst="rect">
+                            <a:avLst/>
+                          </a:prstGeom>
+                          <a:noFill/>
+                        </pic:spPr>
+                      </pic:pic>
+                    </a:graphicData>
+                  </a:graphic>
+                </wp:inline>
+              </w:drawing>
+            </w:r>
+            <w:bookmarkEnd w:id="0"/>
+          </w:p>
+          <w:p>
+            <w:pPr>
+              <w:keepLines/>
+              <w:spacing w:before="100" w:after="100" w:line="240" w:lineRule="auto"/>
+              <w:jc w:val="center"/>
+            </w:pPr>
+            <w:bookmarkStart w:id="0" w:name="_GoBack"/>
+            <w:r>
+              <w:drawing>
+                <wp:inline distT="0" distB="0" distL="0" distR="0">
+                  <wp:extent cx="4920615" cy="2036117"/>
+                  <wp:effectExtent l="0" t="0" r="0" b="0"/>
+                  <wp:docPr id="202" name="E-R图：报名与入学" descr="实体、联系与基数；按当前SQL的外键和唯一约束绘制。"/>
+                  <wp:cNvGraphicFramePr>
+                    <a:graphicFrameLocks xmlns:a="http://schemas.openxmlformats.org/drawingml/2006/main" noChangeAspect="1"/>
+                  </wp:cNvGraphicFramePr>
+                  <a:graphic xmlns:a="http://schemas.openxmlformats.org/drawingml/2006/main">
+                    <a:graphicData uri="http://schemas.openxmlformats.org/drawingml/2006/picture">
+                      <pic:pic xmlns:pic="http://schemas.openxmlformats.org/drawingml/2006/picture">
+                        <pic:nvPicPr>
+                          <pic:cNvPr id="202" name="E-R图：报名与入学" descr="实体、联系与基数；按当前SQL的外键和唯一约束绘制。"/>
+                          <pic:cNvPicPr>
+                            <a:picLocks noChangeAspect="1" noChangeArrowheads="1"/>
+                          </pic:cNvPicPr>
+                        </pic:nvPicPr>
+                        <pic:blipFill>
+                          <a:blip r:embed="rIdErCorrected2"/>
+                          <a:stretch>
+                            <a:fillRect/>
+                          </a:stretch>
+                        </pic:blipFill>
+                        <pic:spPr>
+                          <a:xfrm>
+                            <a:off x="0" y="0"/>
+                            <a:ext cx="4920615" cy="2036117"/>
+                          </a:xfrm>
+                          <a:prstGeom prst="rect">
+                            <a:avLst/>
+                          </a:prstGeom>
+                          <a:noFill/>
+                        </pic:spPr>
+                      </pic:pic>
+                    </a:graphicData>
+                  </a:graphic>
+                </wp:inline>
+              </w:drawing>
+            </w:r>
+            <w:bookmarkEnd w:id="0"/>
+          </w:p>
+          <w:p>
+            <w:pPr>
+              <w:keepLines/>
+              <w:spacing w:before="100" w:after="100" w:line="240" w:lineRule="auto"/>
+              <w:jc w:val="center"/>
+            </w:pPr>
+            <w:bookmarkStart w:id="0" w:name="_GoBack"/>
+            <w:r>
+              <w:drawing>
+                <wp:inline distT="0" distB="0" distL="0" distR="0">
+                  <wp:extent cx="4920615" cy="3266270"/>
+                  <wp:effectExtent l="0" t="0" r="0" b="0"/>
+                  <wp:docPr id="203" name="E-R图：培训预约与学时" descr="实体、联系与基数；按当前SQL的外键和唯一约束绘制。"/>
+                  <wp:cNvGraphicFramePr>
+                    <a:graphicFrameLocks xmlns:a="http://schemas.openxmlformats.org/drawingml/2006/main" noChangeAspect="1"/>
+                  </wp:cNvGraphicFramePr>
+                  <a:graphic xmlns:a="http://schemas.openxmlformats.org/drawingml/2006/main">
+                    <a:graphicData uri="http://schemas.openxmlformats.org/drawingml/2006/picture">
+                      <pic:pic xmlns:pic="http://schemas.openxmlformats.org/drawingml/2006/picture">
+                        <pic:nvPicPr>
+                          <pic:cNvPr id="203" name="E-R图：培训预约与学时" descr="实体、联系与基数；按当前SQL的外键和唯一约束绘制。"/>
+                          <pic:cNvPicPr>
+                            <a:picLocks noChangeAspect="1" noChangeArrowheads="1"/>
+                          </pic:cNvPicPr>
+                        </pic:nvPicPr>
+                        <pic:blipFill>
+                          <a:blip r:embed="rIdErCorrected3"/>
+                          <a:stretch>
+                            <a:fillRect/>
+                          </a:stretch>
+                        </pic:blipFill>
+                        <pic:spPr>
+                          <a:xfrm>
+                            <a:off x="0" y="0"/>
+                            <a:ext cx="4920615" cy="3266270"/>
+                          </a:xfrm>
+                          <a:prstGeom prst="rect">
+                            <a:avLst/>
+                          </a:prstGeom>
+                          <a:noFill/>
+                        </pic:spPr>
+                      </pic:pic>
+                    </a:graphicData>
+                  </a:graphic>
+                </wp:inline>
+              </w:drawing>
+            </w:r>
+            <w:bookmarkEnd w:id="0"/>
+          </w:p>
+          <w:p>
+            <w:pPr>
+              <w:keepLines/>
+              <w:spacing w:before="100" w:after="100" w:line="240" w:lineRule="auto"/>
+              <w:jc w:val="center"/>
+            </w:pPr>
+            <w:bookmarkStart w:id="0" w:name="_GoBack"/>
+            <w:r>
+              <w:drawing>
+                <wp:inline distT="0" distB="0" distL="0" distR="0">
+                  <wp:extent cx="4920615" cy="3351108"/>
+                  <wp:effectExtent l="0" t="0" r="0" b="0"/>
+                  <wp:docPr id="204" name="E-R图：题库与模拟考试" descr="实体、联系与基数；按当前SQL的外键和唯一约束绘制。"/>
+                  <wp:cNvGraphicFramePr>
+                    <a:graphicFrameLocks xmlns:a="http://schemas.openxmlformats.org/drawingml/2006/main" noChangeAspect="1"/>
+                  </wp:cNvGraphicFramePr>
+                  <a:graphic xmlns:a="http://schemas.openxmlformats.org/drawingml/2006/main">
+                    <a:graphicData uri="http://schemas.openxmlformats.org/drawingml/2006/picture">
+                      <pic:pic xmlns:pic="http://schemas.openxmlformats.org/drawingml/2006/picture">
+                        <pic:nvPicPr>
+                          <pic:cNvPr id="204" name="E-R图：题库与模拟考试" descr="实体、联系与基数；按当前SQL的外键和唯一约束绘制。"/>
+                          <pic:cNvPicPr>
+                            <a:picLocks noChangeAspect="1" noChangeArrowheads="1"/>
+                          </pic:cNvPicPr>
+                        </pic:nvPicPr>
+                        <pic:blipFill>
+                          <a:blip r:embed="rIdErCorrected4"/>
+                          <a:stretch>
+                            <a:fillRect/>
+                          </a:stretch>
+                        </pic:blipFill>
+                        <pic:spPr>
+                          <a:xfrm>
+                            <a:off x="0" y="0"/>
+                            <a:ext cx="4920615" cy="3351108"/>
+                          </a:xfrm>
+                          <a:prstGeom prst="rect">
+                            <a:avLst/>
+                          </a:prstGeom>
+                          <a:noFill/>
+                        </pic:spPr>
+                      </pic:pic>
+                    </a:graphicData>
+                  </a:graphic>
+                </wp:inline>
+              </w:drawing>
+            </w:r>
+            <w:bookmarkEnd w:id="0"/>
+          </w:p>
+          <w:p>
+            <w:pPr>
+              <w:keepLines/>
+              <w:spacing w:before="100" w:after="100" w:line="240" w:lineRule="auto"/>
+              <w:jc w:val="center"/>
+            </w:pPr>
+            <w:bookmarkStart w:id="0" w:name="_GoBack"/>
+            <w:r>
+              <w:drawing>
+                <wp:inline distT="0" distB="0" distL="0" distR="0">
+                  <wp:extent cx="4920615" cy="1145316"/>
+                  <wp:effectExtent l="0" t="0" r="0" b="0"/>
+                  <wp:docPr id="205" name="E-R图：退学与退费" descr="实体、联系与基数；按当前SQL的外键和唯一约束绘制。"/>
+                  <wp:cNvGraphicFramePr>
+                    <a:graphicFrameLocks xmlns:a="http://schemas.openxmlformats.org/drawingml/2006/main" noChangeAspect="1"/>
+                  </wp:cNvGraphicFramePr>
+                  <a:graphic xmlns:a="http://schemas.openxmlformats.org/drawingml/2006/main">
+                    <a:graphicData uri="http://schemas.openxmlformats.org/drawingml/2006/picture">
+                      <pic:pic xmlns:pic="http://schemas.openxmlformats.org/drawingml/2006/picture">
+                        <pic:nvPicPr>
+                          <pic:cNvPr id="205" name="E-R图：退学与退费" descr="实体、联系与基数；按当前SQL的外键和唯一约束绘制。"/>
+                          <pic:cNvPicPr>
+                            <a:picLocks noChangeAspect="1" noChangeArrowheads="1"/>
+                          </pic:cNvPicPr>
+                        </pic:nvPicPr>
+                        <pic:blipFill>
+                          <a:blip r:embed="rIdErCorrected5"/>
+                          <a:stretch>
+                            <a:fillRect/>
+                          </a:stretch>
+                        </pic:blipFill>
+                        <pic:spPr>
+                          <a:xfrm>
+                            <a:off x="0" y="0"/>
+                            <a:ext cx="4920615" cy="1145316"/>
                           </a:xfrm>
                           <a:prstGeom prst="rect">
                             <a:avLst/>

</xml_diff>

<commit_message>
docs: complete concise use cases and correct assignment inconsistencies
</commit_message>
<xml_diff>
--- a/docs/组长241548153_谭卓谦_作业01_重绘图版.docx
+++ b/docs/组长241548153_谭卓谦_作业01_重绘图版.docx
@@ -265,6 +265,7 @@
                 <w:rFonts w:ascii="宋体" w:hAnsi="宋体" w:eastAsia="宋体"/>
                 <w:b w:val="0"/>
                 <w:sz w:val="21"/>
+                <w:szCs w:val="21"/>
               </w:rPr>
               <w:t>241548153</w:t>
             </w:r>
@@ -282,9 +283,10 @@
             </w:pPr>
             <w:r>
               <w:rPr>
-                <w:rFonts w:ascii="宋体" w:hAnsi="宋体"/>
-                <w:b w:val="0"/>
-                <w:sz w:val="21"/>
+                <w:rFonts w:ascii="宋体" w:hAnsi="宋体" w:eastAsia="宋体"/>
+                <w:b w:val="0"/>
+                <w:sz w:val="21"/>
+                <w:szCs w:val="21"/>
               </w:rPr>
               <w:t>谭卓谦</w:t>
             </w:r>
@@ -302,9 +304,10 @@
             </w:pPr>
             <w:r>
               <w:rPr>
-                <w:rFonts w:ascii="宋体" w:hAnsi="宋体"/>
-                <w:b w:val="0"/>
-                <w:sz w:val="21"/>
+                <w:rFonts w:ascii="宋体" w:hAnsi="宋体" w:eastAsia="宋体"/>
+                <w:b w:val="0"/>
+                <w:sz w:val="21"/>
+                <w:szCs w:val="21"/>
               </w:rPr>
               <w:t>作业</w:t>
             </w:r>
@@ -313,14 +316,16 @@
                 <w:rFonts w:ascii="宋体" w:hAnsi="宋体" w:eastAsia="宋体"/>
                 <w:b w:val="0"/>
                 <w:sz w:val="21"/>
+                <w:szCs w:val="21"/>
               </w:rPr>
               <w:t>01</w:t>
             </w:r>
             <w:r>
               <w:rPr>
-                <w:rFonts w:ascii="宋体" w:hAnsi="宋体"/>
-                <w:b w:val="0"/>
-                <w:sz w:val="21"/>
+                <w:rFonts w:ascii="宋体" w:hAnsi="宋体" w:eastAsia="宋体"/>
+                <w:b w:val="0"/>
+                <w:sz w:val="21"/>
+                <w:szCs w:val="21"/>
               </w:rPr>
               <w:t>：选题、系统需求与数据库设计</w:t>
             </w:r>
@@ -396,6 +401,7 @@
                 <w:rFonts w:ascii="宋体" w:hAnsi="宋体" w:eastAsia="宋体"/>
                 <w:b w:val="0"/>
                 <w:sz w:val="21"/>
+                <w:szCs w:val="21"/>
               </w:rPr>
               <w:t>241616118</w:t>
             </w:r>
@@ -413,9 +419,10 @@
             </w:pPr>
             <w:r>
               <w:rPr>
-                <w:rFonts w:ascii="宋体" w:hAnsi="宋体"/>
-                <w:b w:val="0"/>
-                <w:sz w:val="21"/>
+                <w:rFonts w:ascii="宋体" w:hAnsi="宋体" w:eastAsia="宋体"/>
+                <w:b w:val="0"/>
+                <w:sz w:val="21"/>
+                <w:szCs w:val="21"/>
               </w:rPr>
               <w:t>陈志鹏</w:t>
             </w:r>
@@ -433,9 +440,10 @@
             </w:pPr>
             <w:r>
               <w:rPr>
-                <w:rFonts w:ascii="宋体" w:hAnsi="宋体"/>
-                <w:b w:val="0"/>
-                <w:sz w:val="21"/>
+                <w:rFonts w:ascii="宋体" w:hAnsi="宋体" w:eastAsia="宋体"/>
+                <w:b w:val="0"/>
+                <w:sz w:val="21"/>
+                <w:szCs w:val="21"/>
               </w:rPr>
               <w:t>作业</w:t>
             </w:r>
@@ -444,14 +452,16 @@
                 <w:rFonts w:ascii="宋体" w:hAnsi="宋体" w:eastAsia="宋体"/>
                 <w:b w:val="0"/>
                 <w:sz w:val="21"/>
+                <w:szCs w:val="21"/>
               </w:rPr>
               <w:t>02</w:t>
             </w:r>
             <w:r>
               <w:rPr>
-                <w:rFonts w:ascii="宋体" w:hAnsi="宋体"/>
-                <w:b w:val="0"/>
-                <w:sz w:val="21"/>
+                <w:rFonts w:ascii="宋体" w:hAnsi="宋体" w:eastAsia="宋体"/>
+                <w:b w:val="0"/>
+                <w:sz w:val="21"/>
+                <w:szCs w:val="21"/>
               </w:rPr>
               <w:t>：实体层、</w:t>
             </w:r>
@@ -460,14 +470,16 @@
                 <w:rFonts w:ascii="宋体" w:hAnsi="宋体" w:eastAsia="宋体"/>
                 <w:b w:val="0"/>
                 <w:sz w:val="21"/>
+                <w:szCs w:val="21"/>
               </w:rPr>
               <w:t>Mapper</w:t>
             </w:r>
             <w:r>
               <w:rPr>
-                <w:rFonts w:ascii="宋体" w:hAnsi="宋体"/>
-                <w:b w:val="0"/>
-                <w:sz w:val="21"/>
+                <w:rFonts w:ascii="宋体" w:hAnsi="宋体" w:eastAsia="宋体"/>
+                <w:b w:val="0"/>
+                <w:sz w:val="21"/>
+                <w:szCs w:val="21"/>
               </w:rPr>
               <w:t>与视图设计</w:t>
             </w:r>
@@ -543,6 +555,7 @@
                 <w:rFonts w:ascii="宋体" w:hAnsi="宋体" w:eastAsia="宋体"/>
                 <w:b w:val="0"/>
                 <w:sz w:val="21"/>
+                <w:szCs w:val="21"/>
               </w:rPr>
               <w:t>241541217</w:t>
             </w:r>
@@ -560,9 +573,10 @@
             </w:pPr>
             <w:r>
               <w:rPr>
-                <w:rFonts w:ascii="宋体" w:hAnsi="宋体"/>
-                <w:b w:val="0"/>
-                <w:sz w:val="21"/>
+                <w:rFonts w:ascii="宋体" w:hAnsi="宋体" w:eastAsia="宋体"/>
+                <w:b w:val="0"/>
+                <w:sz w:val="21"/>
+                <w:szCs w:val="21"/>
               </w:rPr>
               <w:t>刘梓烨</w:t>
             </w:r>
@@ -580,9 +594,10 @@
             </w:pPr>
             <w:r>
               <w:rPr>
-                <w:rFonts w:ascii="宋体" w:hAnsi="宋体"/>
-                <w:b w:val="0"/>
-                <w:sz w:val="21"/>
+                <w:rFonts w:ascii="宋体" w:hAnsi="宋体" w:eastAsia="宋体"/>
+                <w:b w:val="0"/>
+                <w:sz w:val="21"/>
+                <w:szCs w:val="21"/>
               </w:rPr>
               <w:t>作业</w:t>
             </w:r>
@@ -591,14 +606,16 @@
                 <w:rFonts w:ascii="宋体" w:hAnsi="宋体" w:eastAsia="宋体"/>
                 <w:b w:val="0"/>
                 <w:sz w:val="21"/>
+                <w:szCs w:val="21"/>
               </w:rPr>
               <w:t>03</w:t>
             </w:r>
             <w:r>
               <w:rPr>
-                <w:rFonts w:ascii="宋体" w:hAnsi="宋体"/>
-                <w:b w:val="0"/>
-                <w:sz w:val="21"/>
+                <w:rFonts w:ascii="宋体" w:hAnsi="宋体" w:eastAsia="宋体"/>
+                <w:b w:val="0"/>
+                <w:sz w:val="21"/>
+                <w:szCs w:val="21"/>
               </w:rPr>
               <w:t>：业务逻辑、控制层与集成</w:t>
             </w:r>
@@ -729,9 +746,10 @@
             </w:pPr>
             <w:r>
               <w:rPr>
-                <w:rFonts w:ascii="宋体" w:hAnsi="宋体"/>
+                <w:rFonts w:ascii="宋体" w:hAnsi="宋体" w:eastAsia="宋体"/>
                 <w:b/>
                 <w:sz w:val="21"/>
+                <w:szCs w:val="21"/>
               </w:rPr>
               <w:t>驾校培训与考试管理系统</w:t>
             </w:r>
@@ -823,9 +841,10 @@
             </w:pPr>
             <w:r>
               <w:rPr>
-                <w:rFonts w:ascii="宋体" w:hAnsi="宋体"/>
-                <w:b w:val="0"/>
-                <w:sz w:val="21"/>
+                <w:rFonts w:ascii="宋体" w:hAnsi="宋体" w:eastAsia="宋体"/>
+                <w:b w:val="0"/>
+                <w:sz w:val="21"/>
+                <w:szCs w:val="21"/>
               </w:rPr>
               <w:t xml:space="preserve">本项目围绕驾校学员的报名、培训预约、内部理论模拟考试和退学退费进行设计。系统服务于学员、教务、教练、财务和管理员五类角色，采用 </w:t>
             </w:r>
@@ -834,14 +853,16 @@
                 <w:rFonts w:ascii="宋体" w:hAnsi="宋体" w:eastAsia="宋体"/>
                 <w:b w:val="0"/>
                 <w:sz w:val="21"/>
+                <w:szCs w:val="21"/>
               </w:rPr>
               <w:t>Spring Boot</w:t>
             </w:r>
             <w:r>
               <w:rPr>
-                <w:rFonts w:ascii="宋体" w:hAnsi="宋体"/>
-                <w:b w:val="0"/>
-                <w:sz w:val="21"/>
+                <w:rFonts w:ascii="宋体" w:hAnsi="宋体" w:eastAsia="宋体"/>
+                <w:b w:val="0"/>
+                <w:sz w:val="21"/>
+                <w:szCs w:val="21"/>
               </w:rPr>
               <w:t>、</w:t>
             </w:r>
@@ -850,14 +871,16 @@
                 <w:rFonts w:ascii="宋体" w:hAnsi="宋体" w:eastAsia="宋体"/>
                 <w:b w:val="0"/>
                 <w:sz w:val="21"/>
+                <w:szCs w:val="21"/>
               </w:rPr>
               <w:t>MyBatis</w:t>
             </w:r>
             <w:r>
               <w:rPr>
-                <w:rFonts w:ascii="宋体" w:hAnsi="宋体"/>
-                <w:b w:val="0"/>
-                <w:sz w:val="21"/>
+                <w:rFonts w:ascii="宋体" w:hAnsi="宋体" w:eastAsia="宋体"/>
+                <w:b w:val="0"/>
+                <w:sz w:val="21"/>
+                <w:szCs w:val="21"/>
               </w:rPr>
               <w:t>、</w:t>
             </w:r>
@@ -866,14 +889,16 @@
                 <w:rFonts w:ascii="宋体" w:hAnsi="宋体" w:eastAsia="宋体"/>
                 <w:b w:val="0"/>
                 <w:sz w:val="21"/>
+                <w:szCs w:val="21"/>
               </w:rPr>
               <w:t xml:space="preserve">MySQL </w:t>
             </w:r>
             <w:r>
               <w:rPr>
-                <w:rFonts w:ascii="宋体" w:hAnsi="宋体"/>
-                <w:b w:val="0"/>
-                <w:sz w:val="21"/>
+                <w:rFonts w:ascii="宋体" w:hAnsi="宋体" w:eastAsia="宋体"/>
+                <w:b w:val="0"/>
+                <w:sz w:val="21"/>
+                <w:szCs w:val="21"/>
               </w:rPr>
               <w:t xml:space="preserve">和 </w:t>
             </w:r>
@@ -882,14 +907,16 @@
                 <w:rFonts w:ascii="宋体" w:hAnsi="宋体" w:eastAsia="宋体"/>
                 <w:b w:val="0"/>
                 <w:sz w:val="21"/>
+                <w:szCs w:val="21"/>
               </w:rPr>
               <w:t xml:space="preserve">Thymeleaf </w:t>
             </w:r>
             <w:r>
               <w:rPr>
-                <w:rFonts w:ascii="宋体" w:hAnsi="宋体"/>
-                <w:b w:val="0"/>
-                <w:sz w:val="21"/>
+                <w:rFonts w:ascii="宋体" w:hAnsi="宋体" w:eastAsia="宋体"/>
+                <w:b w:val="0"/>
+                <w:sz w:val="21"/>
+                <w:szCs w:val="21"/>
               </w:rPr>
               <w:t>作为后续实现方案。正式驾考排考与官方成绩判定不属于本系统，模拟考试仅用于校内理论练习。</w:t>
             </w:r>
@@ -963,9 +990,10 @@
             </w:pPr>
             <w:r>
               <w:rPr>
-                <w:rFonts w:ascii="宋体" w:hAnsi="宋体"/>
-                <w:b w:val="0"/>
-                <w:sz w:val="21"/>
+                <w:rFonts w:ascii="宋体" w:hAnsi="宋体" w:eastAsia="宋体"/>
+                <w:b w:val="0"/>
+                <w:sz w:val="21"/>
+                <w:szCs w:val="21"/>
               </w:rPr>
               <w:t>学员负责注册、报名、预约、练习和退学申请；教务负责审核报名、分配资源、审核考试与核定退费；教练维护题库、提交考试方案、登记训练；财务登记缴费和退款；管理员维护用户、角色与菜单。三人学号后两位相加为</w:t>
             </w:r>
@@ -974,14 +1002,16 @@
                 <w:rFonts w:ascii="宋体" w:hAnsi="宋体" w:eastAsia="宋体"/>
                 <w:b w:val="0"/>
                 <w:sz w:val="21"/>
+                <w:szCs w:val="21"/>
               </w:rPr>
               <w:t>88</w:t>
             </w:r>
             <w:r>
               <w:rPr>
-                <w:rFonts w:ascii="宋体" w:hAnsi="宋体"/>
-                <w:b w:val="0"/>
-                <w:sz w:val="21"/>
+                <w:rFonts w:ascii="宋体" w:hAnsi="宋体" w:eastAsia="宋体"/>
+                <w:b w:val="0"/>
+                <w:sz w:val="21"/>
+                <w:szCs w:val="21"/>
               </w:rPr>
               <w:t>，后续页面采用</w:t>
             </w:r>
@@ -990,14 +1020,16 @@
                 <w:rFonts w:ascii="宋体" w:hAnsi="宋体" w:eastAsia="宋体"/>
                 <w:b w:val="0"/>
                 <w:sz w:val="21"/>
+                <w:szCs w:val="21"/>
               </w:rPr>
               <w:t>B</w:t>
             </w:r>
             <w:r>
               <w:rPr>
-                <w:rFonts w:ascii="宋体" w:hAnsi="宋体"/>
-                <w:b w:val="0"/>
-                <w:sz w:val="21"/>
+                <w:rFonts w:ascii="宋体" w:hAnsi="宋体" w:eastAsia="宋体"/>
+                <w:b w:val="0"/>
+                <w:sz w:val="21"/>
+                <w:szCs w:val="21"/>
               </w:rPr>
               <w:t>布局：右侧菜单、左侧内容。</w:t>
             </w:r>
@@ -1089,9 +1121,10 @@
             </w:pPr>
             <w:r>
               <w:rPr>
-                <w:rFonts w:ascii="宋体" w:hAnsi="宋体"/>
-                <w:b w:val="0"/>
-                <w:sz w:val="21"/>
+                <w:rFonts w:ascii="宋体" w:hAnsi="宋体" w:eastAsia="宋体"/>
+                <w:b w:val="0"/>
+                <w:sz w:val="21"/>
+                <w:szCs w:val="21"/>
               </w:rPr>
               <w:t>系统用例按公共功能、报名与入学、培训预约与学时、题库与模拟考试、退学与退费分图展示。同名参与者在不同分图中表示同一角色。</w:t>
             </w:r>
@@ -1365,7 +1398,7 @@
           </w:tblCellMar>
         </w:tblPrEx>
         <w:trPr>
-          <w:trHeight w:val="78" w:hRule="atLeast"/>
+          <w:cantSplit/>
         </w:trPr>
         <w:tc>
           <w:tcPr>
@@ -1417,77 +1450,17 @@
           </w:tcPr>
           <w:p>
             <w:pPr>
-              <w:spacing w:before="0" w:after="60" w:line="276" w:lineRule="auto"/>
-              <w:jc w:val="left"/>
-            </w:pPr>
-            <w:r>
-              <w:rPr>
-                <w:rFonts w:ascii="宋体" w:hAnsi="宋体"/>
-                <w:b w:val="0"/>
-                <w:sz w:val="21"/>
-              </w:rPr>
-              <w:t>用例</w:t>
-            </w:r>
-            <w:r>
-              <w:rPr>
-                <w:rFonts w:ascii="宋体" w:hAnsi="宋体" w:eastAsia="宋体"/>
-                <w:b w:val="0"/>
-                <w:sz w:val="21"/>
-              </w:rPr>
-              <w:t>1</w:t>
-            </w:r>
-            <w:r>
-              <w:rPr>
-                <w:rFonts w:ascii="宋体" w:hAnsi="宋体"/>
-                <w:b w:val="0"/>
-                <w:sz w:val="21"/>
-              </w:rPr>
-              <w:t>：提交及修改报名（</w:t>
-            </w:r>
-            <w:r>
-              <w:rPr>
-                <w:rFonts w:ascii="宋体" w:hAnsi="宋体" w:eastAsia="宋体"/>
-                <w:b w:val="0"/>
-                <w:sz w:val="21"/>
-              </w:rPr>
-              <w:t>UC03</w:t>
-            </w:r>
-            <w:r>
-              <w:rPr>
-                <w:rFonts w:ascii="宋体" w:hAnsi="宋体"/>
-                <w:b w:val="0"/>
-                <w:sz w:val="21"/>
-              </w:rPr>
-              <w:t>）</w:t>
-            </w:r>
-          </w:p>
-          <w:p>
-            <w:pPr>
-              <w:spacing w:before="0" w:after="60" w:line="276" w:lineRule="auto"/>
-            </w:pPr>
-            <w:r>
-              <w:rPr>
-                <w:rFonts w:ascii="宋体" w:hAnsi="宋体"/>
-                <w:b w:val="0"/>
-                <w:sz w:val="21"/>
-              </w:rPr>
-              <w:t>参与者：学员。前置条件：学员已登录。主流程：选择套餐、填写资料、提交报名；教务后续审核。异常：报名已审核或已缴费时不可由学员直接修改。后置条件：报名状态为</w:t>
-            </w:r>
-            <w:r>
-              <w:rPr>
-                <w:rFonts w:ascii="宋体" w:hAnsi="宋体" w:eastAsia="宋体"/>
-                <w:b w:val="0"/>
-                <w:sz w:val="21"/>
-              </w:rPr>
-              <w:t>SUBMITTED</w:t>
-            </w:r>
-            <w:r>
-              <w:rPr>
-                <w:rFonts w:ascii="宋体" w:hAnsi="宋体"/>
-                <w:b w:val="0"/>
-                <w:sz w:val="21"/>
-              </w:rPr>
-              <w:t>。</w:t>
+              <w:keepLines/>
+              <w:snapToGrid w:val="0"/>
+              <w:spacing w:before="0" w:after="80" w:line="276" w:lineRule="auto"/>
+            </w:pPr>
+            <w:r>
+              <w:rPr>
+                <w:rFonts w:ascii="宋体" w:hAnsi="宋体" w:eastAsia="宋体"/>
+                <w:sz w:val="21"/>
+                <w:szCs w:val="21"/>
+              </w:rPr>
+              <w:t>UC01 注册、登录与退出：学员可注册账号，各角色登录后使用对应功能并安全退出。</w:t>
             </w:r>
           </w:p>
         </w:tc>
@@ -1524,18 +1497,15 @@
           </w:tblCellMar>
         </w:tblPrEx>
         <w:trPr>
-          <w:trHeight w:val="78" w:hRule="atLeast"/>
+          <w:cantSplit/>
         </w:trPr>
         <w:tc>
           <w:tcPr>
             <w:tcW w:w="1123" w:type="dxa"/>
             <w:vMerge w:val="continue"/>
-          </w:tcPr>
-          <w:p>
-            <w:pPr>
-              <w:spacing w:before="0" w:after="0"/>
-            </w:pPr>
-          </w:p>
+            <w:vAlign w:val="center"/>
+          </w:tcPr>
+          <w:p/>
         </w:tc>
         <w:tc>
           <w:tcPr>
@@ -1544,77 +1514,17 @@
           </w:tcPr>
           <w:p>
             <w:pPr>
-              <w:spacing w:before="0" w:after="60" w:line="276" w:lineRule="auto"/>
-              <w:jc w:val="left"/>
-            </w:pPr>
-            <w:r>
-              <w:rPr>
-                <w:rFonts w:ascii="宋体" w:hAnsi="宋体"/>
-                <w:b w:val="0"/>
-                <w:sz w:val="21"/>
-              </w:rPr>
-              <w:t>用例</w:t>
-            </w:r>
-            <w:r>
-              <w:rPr>
-                <w:rFonts w:ascii="宋体" w:hAnsi="宋体" w:eastAsia="宋体"/>
-                <w:b w:val="0"/>
-                <w:sz w:val="21"/>
-              </w:rPr>
-              <w:t>2</w:t>
-            </w:r>
-            <w:r>
-              <w:rPr>
-                <w:rFonts w:ascii="宋体" w:hAnsi="宋体"/>
-                <w:b w:val="0"/>
-                <w:sz w:val="21"/>
-              </w:rPr>
-              <w:t>：分配培训资源（</w:t>
-            </w:r>
-            <w:r>
-              <w:rPr>
-                <w:rFonts w:ascii="宋体" w:hAnsi="宋体" w:eastAsia="宋体"/>
-                <w:b w:val="0"/>
-                <w:sz w:val="21"/>
-              </w:rPr>
-              <w:t>UC09</w:t>
-            </w:r>
-            <w:r>
-              <w:rPr>
-                <w:rFonts w:ascii="宋体" w:hAnsi="宋体"/>
-                <w:b w:val="0"/>
-                <w:sz w:val="21"/>
-              </w:rPr>
-              <w:t>）</w:t>
-            </w:r>
-          </w:p>
-          <w:p>
-            <w:pPr>
-              <w:spacing w:before="0" w:after="60" w:line="276" w:lineRule="auto"/>
-            </w:pPr>
-            <w:r>
-              <w:rPr>
-                <w:rFonts w:ascii="宋体" w:hAnsi="宋体"/>
-                <w:b w:val="0"/>
-                <w:sz w:val="21"/>
-              </w:rPr>
-              <w:t>参与者：教务。前置条件：存在待分配预约。主流程：选择教练和车辆并确认分配。异常：同一时段教练或车辆冲突时拒绝分配。后置条件：预约变为</w:t>
-            </w:r>
-            <w:r>
-              <w:rPr>
-                <w:rFonts w:ascii="宋体" w:hAnsi="宋体" w:eastAsia="宋体"/>
-                <w:b w:val="0"/>
-                <w:sz w:val="21"/>
-              </w:rPr>
-              <w:t>ASSIGNED</w:t>
-            </w:r>
-            <w:r>
-              <w:rPr>
-                <w:rFonts w:ascii="宋体" w:hAnsi="宋体"/>
-                <w:b w:val="0"/>
-                <w:sz w:val="21"/>
-              </w:rPr>
-              <w:t>。</w:t>
+              <w:keepLines/>
+              <w:snapToGrid w:val="0"/>
+              <w:spacing w:before="0" w:after="80" w:line="276" w:lineRule="auto"/>
+            </w:pPr>
+            <w:r>
+              <w:rPr>
+                <w:rFonts w:ascii="宋体" w:hAnsi="宋体" w:eastAsia="宋体"/>
+                <w:sz w:val="21"/>
+                <w:szCs w:val="21"/>
+              </w:rPr>
+              <w:t>UC02 管理用户、角色和菜单：管理员维护用户账号、角色及菜单，分配相应使用权限。</w:t>
             </w:r>
           </w:p>
         </w:tc>
@@ -1651,22 +1561,15 @@
           </w:tblCellMar>
         </w:tblPrEx>
         <w:trPr>
-          <w:trHeight w:val="78" w:hRule="atLeast"/>
+          <w:cantSplit/>
         </w:trPr>
         <w:tc>
           <w:tcPr>
             <w:tcW w:w="1123" w:type="dxa"/>
             <w:vMerge w:val="continue"/>
-          </w:tcPr>
-          <w:p>
-            <w:pPr>
-              <w:spacing w:before="0" w:after="0"/>
-              <w:rPr>
-                <w:sz w:val="24"/>
-                <w:szCs w:val="24"/>
-              </w:rPr>
-            </w:pPr>
-          </w:p>
+            <w:vAlign w:val="center"/>
+          </w:tcPr>
+          <w:p/>
         </w:tc>
         <w:tc>
           <w:tcPr>
@@ -1675,109 +1578,17 @@
           </w:tcPr>
           <w:p>
             <w:pPr>
-              <w:spacing w:before="0" w:after="60" w:line="276" w:lineRule="auto"/>
-              <w:jc w:val="left"/>
-            </w:pPr>
-            <w:r>
-              <w:rPr>
-                <w:rFonts w:ascii="宋体" w:hAnsi="宋体"/>
-                <w:b w:val="0"/>
-                <w:sz w:val="21"/>
-              </w:rPr>
-              <w:t>用例</w:t>
-            </w:r>
-            <w:r>
-              <w:rPr>
-                <w:rFonts w:ascii="宋体" w:hAnsi="宋体" w:eastAsia="宋体"/>
-                <w:b w:val="0"/>
-                <w:sz w:val="21"/>
-              </w:rPr>
-              <w:t>3</w:t>
-            </w:r>
-            <w:r>
-              <w:rPr>
-                <w:rFonts w:ascii="宋体" w:hAnsi="宋体"/>
-                <w:b w:val="0"/>
-                <w:sz w:val="21"/>
-              </w:rPr>
-              <w:t>：随机组卷并参加考试（</w:t>
-            </w:r>
-            <w:r>
-              <w:rPr>
-                <w:rFonts w:ascii="宋体" w:hAnsi="宋体" w:eastAsia="宋体"/>
-                <w:b w:val="0"/>
-                <w:sz w:val="21"/>
-              </w:rPr>
-              <w:t>UC15</w:t>
-            </w:r>
-            <w:r>
-              <w:rPr>
-                <w:rFonts w:ascii="宋体" w:hAnsi="宋体"/>
-                <w:b w:val="0"/>
-                <w:sz w:val="21"/>
-              </w:rPr>
-              <w:t>）</w:t>
-            </w:r>
-          </w:p>
-          <w:p>
-            <w:pPr>
-              <w:spacing w:before="0" w:after="60" w:line="276" w:lineRule="auto"/>
-            </w:pPr>
-            <w:r>
-              <w:rPr>
-                <w:rFonts w:ascii="宋体" w:hAnsi="宋体"/>
-                <w:b w:val="0"/>
-                <w:sz w:val="21"/>
-              </w:rPr>
-              <w:t>参与者：学员。前置条件：学籍有效且考试已发布。主流程：从</w:t>
-            </w:r>
-            <w:r>
-              <w:rPr>
-                <w:rFonts w:ascii="宋体" w:hAnsi="宋体" w:eastAsia="宋体"/>
-                <w:b w:val="0"/>
-                <w:sz w:val="21"/>
-              </w:rPr>
-              <w:t>100</w:t>
-            </w:r>
-            <w:r>
-              <w:rPr>
-                <w:rFonts w:ascii="宋体" w:hAnsi="宋体"/>
-                <w:b w:val="0"/>
-                <w:sz w:val="21"/>
-              </w:rPr>
-              <w:t>道快照中随机抽</w:t>
-            </w:r>
-            <w:r>
-              <w:rPr>
-                <w:rFonts w:ascii="宋体" w:hAnsi="宋体" w:eastAsia="宋体"/>
-                <w:b w:val="0"/>
-                <w:sz w:val="21"/>
-              </w:rPr>
-              <w:t>20</w:t>
-            </w:r>
-            <w:r>
-              <w:rPr>
-                <w:rFonts w:ascii="宋体" w:hAnsi="宋体"/>
-                <w:b w:val="0"/>
-                <w:sz w:val="21"/>
-              </w:rPr>
-              <w:t>题并固定顺序，创建个人答卷。异常：已有进行中答卷时恢复原答卷。后置条件：答卷状态为</w:t>
-            </w:r>
-            <w:r>
-              <w:rPr>
-                <w:rFonts w:ascii="宋体" w:hAnsi="宋体" w:eastAsia="宋体"/>
-                <w:b w:val="0"/>
-                <w:sz w:val="21"/>
-              </w:rPr>
-              <w:t>IN_PROGRESS</w:t>
-            </w:r>
-            <w:r>
-              <w:rPr>
-                <w:rFonts w:ascii="宋体" w:hAnsi="宋体"/>
-                <w:b w:val="0"/>
-                <w:sz w:val="21"/>
-              </w:rPr>
-              <w:t>。</w:t>
+              <w:keepLines/>
+              <w:snapToGrid w:val="0"/>
+              <w:spacing w:before="0" w:after="80" w:line="276" w:lineRule="auto"/>
+            </w:pPr>
+            <w:r>
+              <w:rPr>
+                <w:rFonts w:ascii="宋体" w:hAnsi="宋体" w:eastAsia="宋体"/>
+                <w:sz w:val="21"/>
+                <w:szCs w:val="21"/>
+              </w:rPr>
+              <w:t>UC03 提交及修改报名：学员选择套餐并填写资料提交报名，审核通过前可修改资料后重新提交。</w:t>
             </w:r>
           </w:p>
         </w:tc>
@@ -1814,22 +1625,15 @@
           </w:tblCellMar>
         </w:tblPrEx>
         <w:trPr>
-          <w:trHeight w:val="78" w:hRule="atLeast"/>
+          <w:cantSplit/>
         </w:trPr>
         <w:tc>
           <w:tcPr>
             <w:tcW w:w="1123" w:type="dxa"/>
             <w:vMerge w:val="continue"/>
-          </w:tcPr>
-          <w:p>
-            <w:pPr>
-              <w:spacing w:before="0" w:after="0"/>
-              <w:rPr>
-                <w:sz w:val="24"/>
-                <w:szCs w:val="24"/>
-              </w:rPr>
-            </w:pPr>
-          </w:p>
+            <w:vAlign w:val="center"/>
+          </w:tcPr>
+          <w:p/>
         </w:tc>
         <w:tc>
           <w:tcPr>
@@ -1838,93 +1642,1105 @@
           </w:tcPr>
           <w:p>
             <w:pPr>
-              <w:spacing w:before="0" w:after="60" w:line="276" w:lineRule="auto"/>
-              <w:jc w:val="left"/>
-            </w:pPr>
-            <w:r>
-              <w:rPr>
-                <w:rFonts w:ascii="宋体" w:hAnsi="宋体"/>
-                <w:b w:val="0"/>
-                <w:sz w:val="21"/>
-              </w:rPr>
-              <w:t>用例</w:t>
-            </w:r>
-            <w:r>
-              <w:rPr>
-                <w:rFonts w:ascii="宋体" w:hAnsi="宋体" w:eastAsia="宋体"/>
-                <w:b w:val="0"/>
-                <w:sz w:val="21"/>
-              </w:rPr>
-              <w:t>4</w:t>
-            </w:r>
-            <w:r>
-              <w:rPr>
-                <w:rFonts w:ascii="宋体" w:hAnsi="宋体"/>
-                <w:b w:val="0"/>
-                <w:sz w:val="21"/>
-              </w:rPr>
-              <w:t>：核定退费方案（</w:t>
-            </w:r>
-            <w:r>
-              <w:rPr>
-                <w:rFonts w:ascii="宋体" w:hAnsi="宋体" w:eastAsia="宋体"/>
-                <w:b w:val="0"/>
-                <w:sz w:val="21"/>
-              </w:rPr>
-              <w:t>UC19</w:t>
-            </w:r>
-            <w:r>
-              <w:rPr>
-                <w:rFonts w:ascii="宋体" w:hAnsi="宋体"/>
-                <w:b w:val="0"/>
-                <w:sz w:val="21"/>
-              </w:rPr>
-              <w:t>）</w:t>
-            </w:r>
-          </w:p>
-          <w:p>
-            <w:pPr>
-              <w:spacing w:before="0" w:after="60" w:line="276" w:lineRule="auto"/>
-            </w:pPr>
-            <w:r>
-              <w:rPr>
-                <w:rFonts w:ascii="宋体" w:hAnsi="宋体"/>
-                <w:b w:val="0"/>
-                <w:sz w:val="21"/>
-              </w:rPr>
-              <w:t>参与者：教务。前置条件：学员已提交退学申请。主流程：核对实缴金额与已完成训练，填写审核意见和可退金额。异常：退款金额超过实缴金额时不允许通过。后置条件：申请状态为</w:t>
-            </w:r>
-            <w:r>
-              <w:rPr>
-                <w:rFonts w:ascii="宋体" w:hAnsi="宋体" w:eastAsia="宋体"/>
-                <w:b w:val="0"/>
-                <w:sz w:val="21"/>
-              </w:rPr>
-              <w:t>APPROVED</w:t>
-            </w:r>
-            <w:r>
-              <w:rPr>
-                <w:rFonts w:ascii="宋体" w:hAnsi="宋体"/>
-                <w:b w:val="0"/>
-                <w:sz w:val="21"/>
-              </w:rPr>
-              <w:t>或</w:t>
-            </w:r>
-            <w:r>
-              <w:rPr>
-                <w:rFonts w:ascii="宋体" w:hAnsi="宋体" w:eastAsia="宋体"/>
-                <w:b w:val="0"/>
-                <w:sz w:val="21"/>
-              </w:rPr>
-              <w:t>REJECTED</w:t>
-            </w:r>
-            <w:r>
-              <w:rPr>
-                <w:rFonts w:ascii="宋体" w:hAnsi="宋体"/>
-                <w:b w:val="0"/>
-                <w:sz w:val="21"/>
-              </w:rPr>
-              <w:t>。</w:t>
+              <w:keepLines/>
+              <w:snapToGrid w:val="0"/>
+              <w:spacing w:before="0" w:after="80" w:line="276" w:lineRule="auto"/>
+            </w:pPr>
+            <w:r>
+              <w:rPr>
+                <w:rFonts w:ascii="宋体" w:hAnsi="宋体" w:eastAsia="宋体"/>
+                <w:sz w:val="21"/>
+                <w:szCs w:val="21"/>
+              </w:rPr>
+              <w:t>UC04 审核报名：教务核对学员资料，给出通过或驳回的结果并填写审核意见。</w:t>
+            </w:r>
+          </w:p>
+        </w:tc>
+        <w:tc>
+          <w:tcPr>
+            <w:tcW w:w="477" w:type="dxa"/>
+            <w:shd w:val="clear" w:color="auto" w:fill="FFFFFF" w:themeFill="background1"/>
+          </w:tcPr>
+          <w:p>
+            <w:pPr>
+              <w:spacing w:before="0" w:after="0"/>
+              <w:rPr>
+                <w:szCs w:val="21"/>
+              </w:rPr>
+            </w:pPr>
+          </w:p>
+        </w:tc>
+      </w:tr>
+      <w:tr>
+        <w:tblPrEx>
+          <w:tblBorders>
+            <w:top w:val="single" w:color="auto" w:sz="4" w:space="0"/>
+            <w:left w:val="single" w:color="auto" w:sz="4" w:space="0"/>
+            <w:bottom w:val="single" w:color="auto" w:sz="4" w:space="0"/>
+            <w:right w:val="single" w:color="auto" w:sz="4" w:space="0"/>
+            <w:insideH w:val="single" w:color="auto" w:sz="4" w:space="0"/>
+            <w:insideV w:val="single" w:color="auto" w:sz="4" w:space="0"/>
+          </w:tblBorders>
+          <w:tblCellMar>
+            <w:top w:w="0" w:type="dxa"/>
+            <w:left w:w="108" w:type="dxa"/>
+            <w:bottom w:w="0" w:type="dxa"/>
+            <w:right w:w="108" w:type="dxa"/>
+          </w:tblCellMar>
+        </w:tblPrEx>
+        <w:trPr>
+          <w:cantSplit/>
+        </w:trPr>
+        <w:tc>
+          <w:tcPr>
+            <w:tcW w:w="1123" w:type="dxa"/>
+            <w:vMerge w:val="continue"/>
+            <w:vAlign w:val="center"/>
+          </w:tcPr>
+          <w:p/>
+        </w:tc>
+        <w:tc>
+          <w:tcPr>
+            <w:tcW w:w="6922" w:type="dxa"/>
+            <w:shd w:val="thinDiagCross" w:color="92D050" w:fill="auto"/>
+          </w:tcPr>
+          <w:p>
+            <w:pPr>
+              <w:keepLines/>
+              <w:snapToGrid w:val="0"/>
+              <w:spacing w:before="0" w:after="80" w:line="276" w:lineRule="auto"/>
+            </w:pPr>
+            <w:r>
+              <w:rPr>
+                <w:rFonts w:ascii="宋体" w:hAnsi="宋体" w:eastAsia="宋体"/>
+                <w:sz w:val="21"/>
+                <w:szCs w:val="21"/>
+              </w:rPr>
+              <w:t>UC05 登记缴费：财务登记已审核报名的线下缴费，足额缴费后学籍生效。</w:t>
+            </w:r>
+          </w:p>
+        </w:tc>
+        <w:tc>
+          <w:tcPr>
+            <w:tcW w:w="477" w:type="dxa"/>
+            <w:shd w:val="clear" w:color="auto" w:fill="FFFFFF" w:themeFill="background1"/>
+          </w:tcPr>
+          <w:p>
+            <w:pPr>
+              <w:spacing w:before="0" w:after="0"/>
+              <w:rPr>
+                <w:szCs w:val="21"/>
+              </w:rPr>
+            </w:pPr>
+          </w:p>
+        </w:tc>
+      </w:tr>
+      <w:tr>
+        <w:tblPrEx>
+          <w:tblBorders>
+            <w:top w:val="single" w:color="auto" w:sz="4" w:space="0"/>
+            <w:left w:val="single" w:color="auto" w:sz="4" w:space="0"/>
+            <w:bottom w:val="single" w:color="auto" w:sz="4" w:space="0"/>
+            <w:right w:val="single" w:color="auto" w:sz="4" w:space="0"/>
+            <w:insideH w:val="single" w:color="auto" w:sz="4" w:space="0"/>
+            <w:insideV w:val="single" w:color="auto" w:sz="4" w:space="0"/>
+          </w:tblBorders>
+          <w:tblCellMar>
+            <w:top w:w="0" w:type="dxa"/>
+            <w:left w:w="108" w:type="dxa"/>
+            <w:bottom w:w="0" w:type="dxa"/>
+            <w:right w:w="108" w:type="dxa"/>
+          </w:tblCellMar>
+        </w:tblPrEx>
+        <w:trPr>
+          <w:cantSplit/>
+        </w:trPr>
+        <w:tc>
+          <w:tcPr>
+            <w:tcW w:w="1123" w:type="dxa"/>
+            <w:vMerge w:val="continue"/>
+            <w:vAlign w:val="center"/>
+          </w:tcPr>
+          <w:p/>
+        </w:tc>
+        <w:tc>
+          <w:tcPr>
+            <w:tcW w:w="6922" w:type="dxa"/>
+            <w:shd w:val="thinDiagCross" w:color="92D050" w:fill="auto"/>
+          </w:tcPr>
+          <w:p>
+            <w:pPr>
+              <w:keepLines/>
+              <w:snapToGrid w:val="0"/>
+              <w:spacing w:before="0" w:after="80" w:line="276" w:lineRule="auto"/>
+            </w:pPr>
+            <w:r>
+              <w:rPr>
+                <w:rFonts w:ascii="宋体" w:hAnsi="宋体" w:eastAsia="宋体"/>
+                <w:sz w:val="21"/>
+                <w:szCs w:val="21"/>
+              </w:rPr>
+              <w:t>UC06 查看报名和缴费记录：学员查看本人记录，教务和财务按职责查询报名及缴费情况。</w:t>
+            </w:r>
+          </w:p>
+        </w:tc>
+        <w:tc>
+          <w:tcPr>
+            <w:tcW w:w="477" w:type="dxa"/>
+            <w:shd w:val="clear" w:color="auto" w:fill="FFFFFF" w:themeFill="background1"/>
+          </w:tcPr>
+          <w:p>
+            <w:pPr>
+              <w:spacing w:before="0" w:after="0"/>
+              <w:rPr>
+                <w:szCs w:val="21"/>
+              </w:rPr>
+            </w:pPr>
+          </w:p>
+        </w:tc>
+      </w:tr>
+      <w:tr>
+        <w:tblPrEx>
+          <w:tblBorders>
+            <w:top w:val="single" w:color="auto" w:sz="4" w:space="0"/>
+            <w:left w:val="single" w:color="auto" w:sz="4" w:space="0"/>
+            <w:bottom w:val="single" w:color="auto" w:sz="4" w:space="0"/>
+            <w:right w:val="single" w:color="auto" w:sz="4" w:space="0"/>
+            <w:insideH w:val="single" w:color="auto" w:sz="4" w:space="0"/>
+            <w:insideV w:val="single" w:color="auto" w:sz="4" w:space="0"/>
+          </w:tblBorders>
+          <w:tblCellMar>
+            <w:top w:w="0" w:type="dxa"/>
+            <w:left w:w="108" w:type="dxa"/>
+            <w:bottom w:w="0" w:type="dxa"/>
+            <w:right w:w="108" w:type="dxa"/>
+          </w:tblCellMar>
+        </w:tblPrEx>
+        <w:trPr>
+          <w:cantSplit/>
+        </w:trPr>
+        <w:tc>
+          <w:tcPr>
+            <w:tcW w:w="1123" w:type="dxa"/>
+            <w:vMerge w:val="continue"/>
+            <w:vAlign w:val="center"/>
+          </w:tcPr>
+          <w:p/>
+        </w:tc>
+        <w:tc>
+          <w:tcPr>
+            <w:tcW w:w="6922" w:type="dxa"/>
+            <w:shd w:val="thinDiagCross" w:color="92D050" w:fill="auto"/>
+          </w:tcPr>
+          <w:p>
+            <w:pPr>
+              <w:keepLines/>
+              <w:snapToGrid w:val="0"/>
+              <w:spacing w:before="0" w:after="80" w:line="276" w:lineRule="auto"/>
+            </w:pPr>
+            <w:r>
+              <w:rPr>
+                <w:rFonts w:ascii="宋体" w:hAnsi="宋体" w:eastAsia="宋体"/>
+                <w:sz w:val="21"/>
+                <w:szCs w:val="21"/>
+              </w:rPr>
+              <w:t>UC07 维护车辆和培训时段：教务维护培训车辆和可预约时段，停用或关闭不再使用的资源。</w:t>
+            </w:r>
+          </w:p>
+        </w:tc>
+        <w:tc>
+          <w:tcPr>
+            <w:tcW w:w="477" w:type="dxa"/>
+            <w:shd w:val="clear" w:color="auto" w:fill="FFFFFF" w:themeFill="background1"/>
+          </w:tcPr>
+          <w:p>
+            <w:pPr>
+              <w:spacing w:before="0" w:after="0"/>
+              <w:rPr>
+                <w:szCs w:val="21"/>
+              </w:rPr>
+            </w:pPr>
+          </w:p>
+        </w:tc>
+      </w:tr>
+      <w:tr>
+        <w:tblPrEx>
+          <w:tblBorders>
+            <w:top w:val="single" w:color="auto" w:sz="4" w:space="0"/>
+            <w:left w:val="single" w:color="auto" w:sz="4" w:space="0"/>
+            <w:bottom w:val="single" w:color="auto" w:sz="4" w:space="0"/>
+            <w:right w:val="single" w:color="auto" w:sz="4" w:space="0"/>
+            <w:insideH w:val="single" w:color="auto" w:sz="4" w:space="0"/>
+            <w:insideV w:val="single" w:color="auto" w:sz="4" w:space="0"/>
+          </w:tblBorders>
+          <w:tblCellMar>
+            <w:top w:w="0" w:type="dxa"/>
+            <w:left w:w="108" w:type="dxa"/>
+            <w:bottom w:w="0" w:type="dxa"/>
+            <w:right w:w="108" w:type="dxa"/>
+          </w:tblCellMar>
+        </w:tblPrEx>
+        <w:trPr>
+          <w:cantSplit/>
+        </w:trPr>
+        <w:tc>
+          <w:tcPr>
+            <w:tcW w:w="1123" w:type="dxa"/>
+            <w:vMerge w:val="continue"/>
+            <w:vAlign w:val="center"/>
+          </w:tcPr>
+          <w:p/>
+        </w:tc>
+        <w:tc>
+          <w:tcPr>
+            <w:tcW w:w="6922" w:type="dxa"/>
+            <w:shd w:val="thinDiagCross" w:color="92D050" w:fill="auto"/>
+          </w:tcPr>
+          <w:p>
+            <w:pPr>
+              <w:keepLines/>
+              <w:snapToGrid w:val="0"/>
+              <w:spacing w:before="0" w:after="80" w:line="276" w:lineRule="auto"/>
+            </w:pPr>
+            <w:r>
+              <w:rPr>
+                <w:rFonts w:ascii="宋体" w:hAnsi="宋体" w:eastAsia="宋体"/>
+                <w:sz w:val="21"/>
+                <w:szCs w:val="21"/>
+              </w:rPr>
+              <w:t>UC08 提交或取消预约：有效学员选择尚未开始的时段提交预约，也可在开始前取消预约。</w:t>
+            </w:r>
+          </w:p>
+        </w:tc>
+        <w:tc>
+          <w:tcPr>
+            <w:tcW w:w="477" w:type="dxa"/>
+            <w:shd w:val="clear" w:color="auto" w:fill="FFFFFF" w:themeFill="background1"/>
+          </w:tcPr>
+          <w:p>
+            <w:pPr>
+              <w:spacing w:before="0" w:after="0"/>
+              <w:rPr>
+                <w:szCs w:val="21"/>
+              </w:rPr>
+            </w:pPr>
+          </w:p>
+        </w:tc>
+      </w:tr>
+      <w:tr>
+        <w:tblPrEx>
+          <w:tblBorders>
+            <w:top w:val="single" w:color="auto" w:sz="4" w:space="0"/>
+            <w:left w:val="single" w:color="auto" w:sz="4" w:space="0"/>
+            <w:bottom w:val="single" w:color="auto" w:sz="4" w:space="0"/>
+            <w:right w:val="single" w:color="auto" w:sz="4" w:space="0"/>
+            <w:insideH w:val="single" w:color="auto" w:sz="4" w:space="0"/>
+            <w:insideV w:val="single" w:color="auto" w:sz="4" w:space="0"/>
+          </w:tblBorders>
+          <w:tblCellMar>
+            <w:top w:w="0" w:type="dxa"/>
+            <w:left w:w="108" w:type="dxa"/>
+            <w:bottom w:w="0" w:type="dxa"/>
+            <w:right w:w="108" w:type="dxa"/>
+          </w:tblCellMar>
+        </w:tblPrEx>
+        <w:trPr>
+          <w:cantSplit/>
+        </w:trPr>
+        <w:tc>
+          <w:tcPr>
+            <w:tcW w:w="1123" w:type="dxa"/>
+            <w:vMerge w:val="continue"/>
+            <w:vAlign w:val="center"/>
+          </w:tcPr>
+          <w:p/>
+        </w:tc>
+        <w:tc>
+          <w:tcPr>
+            <w:tcW w:w="6922" w:type="dxa"/>
+            <w:shd w:val="thinDiagCross" w:color="92D050" w:fill="auto"/>
+          </w:tcPr>
+          <w:p>
+            <w:pPr>
+              <w:keepLines/>
+              <w:snapToGrid w:val="0"/>
+              <w:spacing w:before="0" w:after="80" w:line="276" w:lineRule="auto"/>
+            </w:pPr>
+            <w:r>
+              <w:rPr>
+                <w:rFonts w:ascii="宋体" w:hAnsi="宋体" w:eastAsia="宋体"/>
+                <w:sz w:val="21"/>
+                <w:szCs w:val="21"/>
+              </w:rPr>
+              <w:t>UC09 分配培训资源：教务为待处理预约分配教练和车辆，时间冲突时不予分配。</w:t>
+            </w:r>
+          </w:p>
+        </w:tc>
+        <w:tc>
+          <w:tcPr>
+            <w:tcW w:w="477" w:type="dxa"/>
+            <w:shd w:val="clear" w:color="auto" w:fill="FFFFFF" w:themeFill="background1"/>
+          </w:tcPr>
+          <w:p>
+            <w:pPr>
+              <w:spacing w:before="0" w:after="0"/>
+              <w:rPr>
+                <w:szCs w:val="21"/>
+              </w:rPr>
+            </w:pPr>
+          </w:p>
+        </w:tc>
+      </w:tr>
+      <w:tr>
+        <w:tblPrEx>
+          <w:tblBorders>
+            <w:top w:val="single" w:color="auto" w:sz="4" w:space="0"/>
+            <w:left w:val="single" w:color="auto" w:sz="4" w:space="0"/>
+            <w:bottom w:val="single" w:color="auto" w:sz="4" w:space="0"/>
+            <w:right w:val="single" w:color="auto" w:sz="4" w:space="0"/>
+            <w:insideH w:val="single" w:color="auto" w:sz="4" w:space="0"/>
+            <w:insideV w:val="single" w:color="auto" w:sz="4" w:space="0"/>
+          </w:tblBorders>
+          <w:tblCellMar>
+            <w:top w:w="0" w:type="dxa"/>
+            <w:left w:w="108" w:type="dxa"/>
+            <w:bottom w:w="0" w:type="dxa"/>
+            <w:right w:w="108" w:type="dxa"/>
+          </w:tblCellMar>
+        </w:tblPrEx>
+        <w:trPr>
+          <w:cantSplit/>
+        </w:trPr>
+        <w:tc>
+          <w:tcPr>
+            <w:tcW w:w="1123" w:type="dxa"/>
+            <w:vMerge w:val="continue"/>
+            <w:vAlign w:val="center"/>
+          </w:tcPr>
+          <w:p/>
+        </w:tc>
+        <w:tc>
+          <w:tcPr>
+            <w:tcW w:w="6922" w:type="dxa"/>
+            <w:shd w:val="thinDiagCross" w:color="92D050" w:fill="auto"/>
+          </w:tcPr>
+          <w:p>
+            <w:pPr>
+              <w:keepLines/>
+              <w:snapToGrid w:val="0"/>
+              <w:spacing w:before="0" w:after="80" w:line="276" w:lineRule="auto"/>
+            </w:pPr>
+            <w:r>
+              <w:rPr>
+                <w:rFonts w:ascii="宋体" w:hAnsi="宋体" w:eastAsia="宋体"/>
+                <w:sz w:val="21"/>
+                <w:szCs w:val="21"/>
+              </w:rPr>
+              <w:t>UC10 登记培训结果：教练为自己负责的训练填写实际起止时间和有效学时，保存培训结果。</w:t>
+            </w:r>
+          </w:p>
+        </w:tc>
+        <w:tc>
+          <w:tcPr>
+            <w:tcW w:w="477" w:type="dxa"/>
+            <w:shd w:val="clear" w:color="auto" w:fill="FFFFFF" w:themeFill="background1"/>
+          </w:tcPr>
+          <w:p>
+            <w:pPr>
+              <w:spacing w:before="0" w:after="0"/>
+              <w:rPr>
+                <w:szCs w:val="21"/>
+              </w:rPr>
+            </w:pPr>
+          </w:p>
+        </w:tc>
+      </w:tr>
+      <w:tr>
+        <w:tblPrEx>
+          <w:tblBorders>
+            <w:top w:val="single" w:color="auto" w:sz="4" w:space="0"/>
+            <w:left w:val="single" w:color="auto" w:sz="4" w:space="0"/>
+            <w:bottom w:val="single" w:color="auto" w:sz="4" w:space="0"/>
+            <w:right w:val="single" w:color="auto" w:sz="4" w:space="0"/>
+            <w:insideH w:val="single" w:color="auto" w:sz="4" w:space="0"/>
+            <w:insideV w:val="single" w:color="auto" w:sz="4" w:space="0"/>
+          </w:tblBorders>
+          <w:tblCellMar>
+            <w:top w:w="0" w:type="dxa"/>
+            <w:left w:w="108" w:type="dxa"/>
+            <w:bottom w:w="0" w:type="dxa"/>
+            <w:right w:w="108" w:type="dxa"/>
+          </w:tblCellMar>
+        </w:tblPrEx>
+        <w:trPr>
+          <w:cantSplit/>
+        </w:trPr>
+        <w:tc>
+          <w:tcPr>
+            <w:tcW w:w="1123" w:type="dxa"/>
+            <w:vMerge w:val="continue"/>
+            <w:vAlign w:val="center"/>
+          </w:tcPr>
+          <w:p/>
+        </w:tc>
+        <w:tc>
+          <w:tcPr>
+            <w:tcW w:w="6922" w:type="dxa"/>
+            <w:shd w:val="thinDiagCross" w:color="92D050" w:fill="auto"/>
+          </w:tcPr>
+          <w:p>
+            <w:pPr>
+              <w:keepLines/>
+              <w:snapToGrid w:val="0"/>
+              <w:spacing w:before="0" w:after="80" w:line="276" w:lineRule="auto"/>
+            </w:pPr>
+            <w:r>
+              <w:rPr>
+                <w:rFonts w:ascii="宋体" w:hAnsi="宋体" w:eastAsia="宋体"/>
+                <w:sz w:val="21"/>
+                <w:szCs w:val="21"/>
+              </w:rPr>
+              <w:t>UC11 查询培训记录与学时：学员查询本人记录，教务和教练按权限查看培训明细及累计学时。</w:t>
+            </w:r>
+          </w:p>
+        </w:tc>
+        <w:tc>
+          <w:tcPr>
+            <w:tcW w:w="477" w:type="dxa"/>
+            <w:shd w:val="clear" w:color="auto" w:fill="FFFFFF" w:themeFill="background1"/>
+          </w:tcPr>
+          <w:p>
+            <w:pPr>
+              <w:spacing w:before="0" w:after="0"/>
+              <w:rPr>
+                <w:szCs w:val="21"/>
+              </w:rPr>
+            </w:pPr>
+          </w:p>
+        </w:tc>
+      </w:tr>
+      <w:tr>
+        <w:tblPrEx>
+          <w:tblBorders>
+            <w:top w:val="single" w:color="auto" w:sz="4" w:space="0"/>
+            <w:left w:val="single" w:color="auto" w:sz="4" w:space="0"/>
+            <w:bottom w:val="single" w:color="auto" w:sz="4" w:space="0"/>
+            <w:right w:val="single" w:color="auto" w:sz="4" w:space="0"/>
+            <w:insideH w:val="single" w:color="auto" w:sz="4" w:space="0"/>
+            <w:insideV w:val="single" w:color="auto" w:sz="4" w:space="0"/>
+          </w:tblBorders>
+          <w:tblCellMar>
+            <w:top w:w="0" w:type="dxa"/>
+            <w:left w:w="108" w:type="dxa"/>
+            <w:bottom w:w="0" w:type="dxa"/>
+            <w:right w:w="108" w:type="dxa"/>
+          </w:tblCellMar>
+        </w:tblPrEx>
+        <w:trPr>
+          <w:cantSplit/>
+        </w:trPr>
+        <w:tc>
+          <w:tcPr>
+            <w:tcW w:w="1123" w:type="dxa"/>
+            <w:vMerge w:val="continue"/>
+            <w:vAlign w:val="center"/>
+          </w:tcPr>
+          <w:p/>
+        </w:tc>
+        <w:tc>
+          <w:tcPr>
+            <w:tcW w:w="6922" w:type="dxa"/>
+            <w:shd w:val="thinDiagCross" w:color="92D050" w:fill="auto"/>
+          </w:tcPr>
+          <w:p>
+            <w:pPr>
+              <w:keepLines/>
+              <w:snapToGrid w:val="0"/>
+              <w:spacing w:before="0" w:after="80" w:line="276" w:lineRule="auto"/>
+            </w:pPr>
+            <w:r>
+              <w:rPr>
+                <w:rFonts w:ascii="宋体" w:hAnsi="宋体" w:eastAsia="宋体"/>
+                <w:sz w:val="21"/>
+                <w:szCs w:val="21"/>
+              </w:rPr>
+              <w:t>UC12 维护题库：教练新增、修改或停用题目，已发布考试的题目快照保持不变。</w:t>
+            </w:r>
+          </w:p>
+        </w:tc>
+        <w:tc>
+          <w:tcPr>
+            <w:tcW w:w="477" w:type="dxa"/>
+            <w:shd w:val="clear" w:color="auto" w:fill="FFFFFF" w:themeFill="background1"/>
+          </w:tcPr>
+          <w:p>
+            <w:pPr>
+              <w:spacing w:before="0" w:after="0"/>
+              <w:rPr>
+                <w:szCs w:val="21"/>
+              </w:rPr>
+            </w:pPr>
+          </w:p>
+        </w:tc>
+      </w:tr>
+      <w:tr>
+        <w:tblPrEx>
+          <w:tblBorders>
+            <w:top w:val="single" w:color="auto" w:sz="4" w:space="0"/>
+            <w:left w:val="single" w:color="auto" w:sz="4" w:space="0"/>
+            <w:bottom w:val="single" w:color="auto" w:sz="4" w:space="0"/>
+            <w:right w:val="single" w:color="auto" w:sz="4" w:space="0"/>
+            <w:insideH w:val="single" w:color="auto" w:sz="4" w:space="0"/>
+            <w:insideV w:val="single" w:color="auto" w:sz="4" w:space="0"/>
+          </w:tblBorders>
+          <w:tblCellMar>
+            <w:top w:w="0" w:type="dxa"/>
+            <w:left w:w="108" w:type="dxa"/>
+            <w:bottom w:w="0" w:type="dxa"/>
+            <w:right w:w="108" w:type="dxa"/>
+          </w:tblCellMar>
+        </w:tblPrEx>
+        <w:trPr>
+          <w:cantSplit/>
+        </w:trPr>
+        <w:tc>
+          <w:tcPr>
+            <w:tcW w:w="1123" w:type="dxa"/>
+            <w:vMerge w:val="continue"/>
+            <w:vAlign w:val="center"/>
+          </w:tcPr>
+          <w:p/>
+        </w:tc>
+        <w:tc>
+          <w:tcPr>
+            <w:tcW w:w="6922" w:type="dxa"/>
+            <w:shd w:val="thinDiagCross" w:color="92D050" w:fill="auto"/>
+          </w:tcPr>
+          <w:p>
+            <w:pPr>
+              <w:keepLines/>
+              <w:snapToGrid w:val="0"/>
+              <w:spacing w:before="0" w:after="80" w:line="276" w:lineRule="auto"/>
+            </w:pPr>
+            <w:r>
+              <w:rPr>
+                <w:rFonts w:ascii="宋体" w:hAnsi="宋体" w:eastAsia="宋体"/>
+                <w:sz w:val="21"/>
+                <w:szCs w:val="21"/>
+              </w:rPr>
+              <w:t>UC13 提交模拟考试方案：教练选定100道启用题目生成考试方案和题目快照，提交教务审核。</w:t>
+            </w:r>
+          </w:p>
+        </w:tc>
+        <w:tc>
+          <w:tcPr>
+            <w:tcW w:w="477" w:type="dxa"/>
+            <w:shd w:val="clear" w:color="auto" w:fill="FFFFFF" w:themeFill="background1"/>
+          </w:tcPr>
+          <w:p>
+            <w:pPr>
+              <w:spacing w:before="0" w:after="0"/>
+              <w:rPr>
+                <w:szCs w:val="21"/>
+              </w:rPr>
+            </w:pPr>
+          </w:p>
+        </w:tc>
+      </w:tr>
+      <w:tr>
+        <w:tblPrEx>
+          <w:tblBorders>
+            <w:top w:val="single" w:color="auto" w:sz="4" w:space="0"/>
+            <w:left w:val="single" w:color="auto" w:sz="4" w:space="0"/>
+            <w:bottom w:val="single" w:color="auto" w:sz="4" w:space="0"/>
+            <w:right w:val="single" w:color="auto" w:sz="4" w:space="0"/>
+            <w:insideH w:val="single" w:color="auto" w:sz="4" w:space="0"/>
+            <w:insideV w:val="single" w:color="auto" w:sz="4" w:space="0"/>
+          </w:tblBorders>
+          <w:tblCellMar>
+            <w:top w:w="0" w:type="dxa"/>
+            <w:left w:w="108" w:type="dxa"/>
+            <w:bottom w:w="0" w:type="dxa"/>
+            <w:right w:w="108" w:type="dxa"/>
+          </w:tblCellMar>
+        </w:tblPrEx>
+        <w:trPr>
+          <w:cantSplit/>
+        </w:trPr>
+        <w:tc>
+          <w:tcPr>
+            <w:tcW w:w="1123" w:type="dxa"/>
+            <w:vMerge w:val="continue"/>
+            <w:vAlign w:val="center"/>
+          </w:tcPr>
+          <w:p/>
+        </w:tc>
+        <w:tc>
+          <w:tcPr>
+            <w:tcW w:w="6922" w:type="dxa"/>
+            <w:shd w:val="thinDiagCross" w:color="92D050" w:fill="auto"/>
+          </w:tcPr>
+          <w:p>
+            <w:pPr>
+              <w:keepLines/>
+              <w:snapToGrid w:val="0"/>
+              <w:spacing w:before="0" w:after="80" w:line="276" w:lineRule="auto"/>
+            </w:pPr>
+            <w:r>
+              <w:rPr>
+                <w:rFonts w:ascii="宋体" w:hAnsi="宋体" w:eastAsia="宋体"/>
+                <w:sz w:val="21"/>
+                <w:szCs w:val="21"/>
+              </w:rPr>
+              <w:t>UC14 审核发布及关闭模拟考试：教务审核考试方案并决定发布或驳回，也可关闭已发布的考试。</w:t>
+            </w:r>
+          </w:p>
+        </w:tc>
+        <w:tc>
+          <w:tcPr>
+            <w:tcW w:w="477" w:type="dxa"/>
+            <w:shd w:val="clear" w:color="auto" w:fill="FFFFFF" w:themeFill="background1"/>
+          </w:tcPr>
+          <w:p>
+            <w:pPr>
+              <w:spacing w:before="0" w:after="0"/>
+              <w:rPr>
+                <w:szCs w:val="21"/>
+              </w:rPr>
+            </w:pPr>
+          </w:p>
+        </w:tc>
+      </w:tr>
+      <w:tr>
+        <w:tblPrEx>
+          <w:tblBorders>
+            <w:top w:val="single" w:color="auto" w:sz="4" w:space="0"/>
+            <w:left w:val="single" w:color="auto" w:sz="4" w:space="0"/>
+            <w:bottom w:val="single" w:color="auto" w:sz="4" w:space="0"/>
+            <w:right w:val="single" w:color="auto" w:sz="4" w:space="0"/>
+            <w:insideH w:val="single" w:color="auto" w:sz="4" w:space="0"/>
+            <w:insideV w:val="single" w:color="auto" w:sz="4" w:space="0"/>
+          </w:tblBorders>
+          <w:tblCellMar>
+            <w:top w:w="0" w:type="dxa"/>
+            <w:left w:w="108" w:type="dxa"/>
+            <w:bottom w:w="0" w:type="dxa"/>
+            <w:right w:w="108" w:type="dxa"/>
+          </w:tblCellMar>
+        </w:tblPrEx>
+        <w:trPr>
+          <w:cantSplit/>
+        </w:trPr>
+        <w:tc>
+          <w:tcPr>
+            <w:tcW w:w="1123" w:type="dxa"/>
+            <w:vMerge w:val="continue"/>
+            <w:vAlign w:val="center"/>
+          </w:tcPr>
+          <w:p/>
+        </w:tc>
+        <w:tc>
+          <w:tcPr>
+            <w:tcW w:w="6922" w:type="dxa"/>
+            <w:shd w:val="thinDiagCross" w:color="92D050" w:fill="auto"/>
+          </w:tcPr>
+          <w:p>
+            <w:pPr>
+              <w:keepLines/>
+              <w:snapToGrid w:val="0"/>
+              <w:spacing w:before="0" w:after="80" w:line="276" w:lineRule="auto"/>
+            </w:pPr>
+            <w:r>
+              <w:rPr>
+                <w:rFonts w:ascii="宋体" w:hAnsi="宋体" w:eastAsia="宋体"/>
+                <w:sz w:val="21"/>
+                <w:szCs w:val="21"/>
+              </w:rPr>
+              <w:t>UC15 随机组卷并参加考试：有效学员开始考试时随机抽取20道不重复题目，刷新时恢复原答卷。</w:t>
+            </w:r>
+          </w:p>
+        </w:tc>
+        <w:tc>
+          <w:tcPr>
+            <w:tcW w:w="477" w:type="dxa"/>
+            <w:shd w:val="clear" w:color="auto" w:fill="FFFFFF" w:themeFill="background1"/>
+          </w:tcPr>
+          <w:p>
+            <w:pPr>
+              <w:spacing w:before="0" w:after="0"/>
+              <w:rPr>
+                <w:szCs w:val="21"/>
+              </w:rPr>
+            </w:pPr>
+          </w:p>
+        </w:tc>
+      </w:tr>
+      <w:tr>
+        <w:tblPrEx>
+          <w:tblBorders>
+            <w:top w:val="single" w:color="auto" w:sz="4" w:space="0"/>
+            <w:left w:val="single" w:color="auto" w:sz="4" w:space="0"/>
+            <w:bottom w:val="single" w:color="auto" w:sz="4" w:space="0"/>
+            <w:right w:val="single" w:color="auto" w:sz="4" w:space="0"/>
+            <w:insideH w:val="single" w:color="auto" w:sz="4" w:space="0"/>
+            <w:insideV w:val="single" w:color="auto" w:sz="4" w:space="0"/>
+          </w:tblBorders>
+          <w:tblCellMar>
+            <w:top w:w="0" w:type="dxa"/>
+            <w:left w:w="108" w:type="dxa"/>
+            <w:bottom w:w="0" w:type="dxa"/>
+            <w:right w:w="108" w:type="dxa"/>
+          </w:tblCellMar>
+        </w:tblPrEx>
+        <w:trPr>
+          <w:cantSplit/>
+        </w:trPr>
+        <w:tc>
+          <w:tcPr>
+            <w:tcW w:w="1123" w:type="dxa"/>
+            <w:vMerge w:val="continue"/>
+            <w:vAlign w:val="center"/>
+          </w:tcPr>
+          <w:p/>
+        </w:tc>
+        <w:tc>
+          <w:tcPr>
+            <w:tcW w:w="6922" w:type="dxa"/>
+            <w:shd w:val="thinDiagCross" w:color="92D050" w:fill="auto"/>
+          </w:tcPr>
+          <w:p>
+            <w:pPr>
+              <w:keepLines/>
+              <w:snapToGrid w:val="0"/>
+              <w:spacing w:before="0" w:after="80" w:line="276" w:lineRule="auto"/>
+            </w:pPr>
+            <w:r>
+              <w:rPr>
+                <w:rFonts w:ascii="宋体" w:hAnsi="宋体" w:eastAsia="宋体"/>
+                <w:sz w:val="21"/>
+                <w:szCs w:val="21"/>
+              </w:rPr>
+              <w:t>UC16 保存答案、提交答卷及判分：学员保存答案并交卷后由系统判分，超时按已保存答案结算。</w:t>
+            </w:r>
+          </w:p>
+        </w:tc>
+        <w:tc>
+          <w:tcPr>
+            <w:tcW w:w="477" w:type="dxa"/>
+            <w:shd w:val="clear" w:color="auto" w:fill="FFFFFF" w:themeFill="background1"/>
+          </w:tcPr>
+          <w:p>
+            <w:pPr>
+              <w:spacing w:before="0" w:after="0"/>
+              <w:rPr>
+                <w:szCs w:val="21"/>
+              </w:rPr>
+            </w:pPr>
+          </w:p>
+        </w:tc>
+      </w:tr>
+      <w:tr>
+        <w:tblPrEx>
+          <w:tblBorders>
+            <w:top w:val="single" w:color="auto" w:sz="4" w:space="0"/>
+            <w:left w:val="single" w:color="auto" w:sz="4" w:space="0"/>
+            <w:bottom w:val="single" w:color="auto" w:sz="4" w:space="0"/>
+            <w:right w:val="single" w:color="auto" w:sz="4" w:space="0"/>
+            <w:insideH w:val="single" w:color="auto" w:sz="4" w:space="0"/>
+            <w:insideV w:val="single" w:color="auto" w:sz="4" w:space="0"/>
+          </w:tblBorders>
+          <w:tblCellMar>
+            <w:top w:w="0" w:type="dxa"/>
+            <w:left w:w="108" w:type="dxa"/>
+            <w:bottom w:w="0" w:type="dxa"/>
+            <w:right w:w="108" w:type="dxa"/>
+          </w:tblCellMar>
+        </w:tblPrEx>
+        <w:trPr>
+          <w:cantSplit/>
+        </w:trPr>
+        <w:tc>
+          <w:tcPr>
+            <w:tcW w:w="1123" w:type="dxa"/>
+            <w:vMerge w:val="continue"/>
+            <w:vAlign w:val="center"/>
+          </w:tcPr>
+          <w:p/>
+        </w:tc>
+        <w:tc>
+          <w:tcPr>
+            <w:tcW w:w="6922" w:type="dxa"/>
+            <w:shd w:val="thinDiagCross" w:color="92D050" w:fill="auto"/>
+          </w:tcPr>
+          <w:p>
+            <w:pPr>
+              <w:keepLines/>
+              <w:snapToGrid w:val="0"/>
+              <w:spacing w:before="0" w:after="80" w:line="276" w:lineRule="auto"/>
+            </w:pPr>
+            <w:r>
+              <w:rPr>
+                <w:rFonts w:ascii="宋体" w:hAnsi="宋体" w:eastAsia="宋体"/>
+                <w:sz w:val="21"/>
+                <w:szCs w:val="21"/>
+              </w:rPr>
+              <w:t>UC17 查看成绩和错题解析：学员在答卷结束后查看本人分数、及格情况和错题解析。</w:t>
+            </w:r>
+          </w:p>
+        </w:tc>
+        <w:tc>
+          <w:tcPr>
+            <w:tcW w:w="477" w:type="dxa"/>
+            <w:shd w:val="clear" w:color="auto" w:fill="FFFFFF" w:themeFill="background1"/>
+          </w:tcPr>
+          <w:p>
+            <w:pPr>
+              <w:spacing w:before="0" w:after="0"/>
+              <w:rPr>
+                <w:szCs w:val="21"/>
+              </w:rPr>
+            </w:pPr>
+          </w:p>
+        </w:tc>
+      </w:tr>
+      <w:tr>
+        <w:tblPrEx>
+          <w:tblBorders>
+            <w:top w:val="single" w:color="auto" w:sz="4" w:space="0"/>
+            <w:left w:val="single" w:color="auto" w:sz="4" w:space="0"/>
+            <w:bottom w:val="single" w:color="auto" w:sz="4" w:space="0"/>
+            <w:right w:val="single" w:color="auto" w:sz="4" w:space="0"/>
+            <w:insideH w:val="single" w:color="auto" w:sz="4" w:space="0"/>
+            <w:insideV w:val="single" w:color="auto" w:sz="4" w:space="0"/>
+          </w:tblBorders>
+          <w:tblCellMar>
+            <w:top w:w="0" w:type="dxa"/>
+            <w:left w:w="108" w:type="dxa"/>
+            <w:bottom w:w="0" w:type="dxa"/>
+            <w:right w:w="108" w:type="dxa"/>
+          </w:tblCellMar>
+        </w:tblPrEx>
+        <w:trPr>
+          <w:cantSplit/>
+        </w:trPr>
+        <w:tc>
+          <w:tcPr>
+            <w:tcW w:w="1123" w:type="dxa"/>
+            <w:vMerge w:val="continue"/>
+            <w:vAlign w:val="center"/>
+          </w:tcPr>
+          <w:p/>
+        </w:tc>
+        <w:tc>
+          <w:tcPr>
+            <w:tcW w:w="6922" w:type="dxa"/>
+            <w:shd w:val="thinDiagCross" w:color="92D050" w:fill="auto"/>
+          </w:tcPr>
+          <w:p>
+            <w:pPr>
+              <w:keepLines/>
+              <w:snapToGrid w:val="0"/>
+              <w:spacing w:before="0" w:after="80" w:line="276" w:lineRule="auto"/>
+            </w:pPr>
+            <w:r>
+              <w:rPr>
+                <w:rFonts w:ascii="宋体" w:hAnsi="宋体" w:eastAsia="宋体"/>
+                <w:sz w:val="21"/>
+                <w:szCs w:val="21"/>
+              </w:rPr>
+              <w:t>UC18 提交退学申请：学员填写退学原因提交申请，处理中暂停新增预约并取消未来预约。</w:t>
+            </w:r>
+          </w:p>
+        </w:tc>
+        <w:tc>
+          <w:tcPr>
+            <w:tcW w:w="477" w:type="dxa"/>
+            <w:shd w:val="clear" w:color="auto" w:fill="FFFFFF" w:themeFill="background1"/>
+          </w:tcPr>
+          <w:p>
+            <w:pPr>
+              <w:spacing w:before="0" w:after="0"/>
+              <w:rPr>
+                <w:szCs w:val="21"/>
+              </w:rPr>
+            </w:pPr>
+          </w:p>
+        </w:tc>
+      </w:tr>
+      <w:tr>
+        <w:tblPrEx>
+          <w:tblBorders>
+            <w:top w:val="single" w:color="auto" w:sz="4" w:space="0"/>
+            <w:left w:val="single" w:color="auto" w:sz="4" w:space="0"/>
+            <w:bottom w:val="single" w:color="auto" w:sz="4" w:space="0"/>
+            <w:right w:val="single" w:color="auto" w:sz="4" w:space="0"/>
+            <w:insideH w:val="single" w:color="auto" w:sz="4" w:space="0"/>
+            <w:insideV w:val="single" w:color="auto" w:sz="4" w:space="0"/>
+          </w:tblBorders>
+          <w:tblCellMar>
+            <w:top w:w="0" w:type="dxa"/>
+            <w:left w:w="108" w:type="dxa"/>
+            <w:bottom w:w="0" w:type="dxa"/>
+            <w:right w:w="108" w:type="dxa"/>
+          </w:tblCellMar>
+        </w:tblPrEx>
+        <w:trPr>
+          <w:cantSplit/>
+        </w:trPr>
+        <w:tc>
+          <w:tcPr>
+            <w:tcW w:w="1123" w:type="dxa"/>
+            <w:vMerge w:val="continue"/>
+            <w:vAlign w:val="center"/>
+          </w:tcPr>
+          <w:p/>
+        </w:tc>
+        <w:tc>
+          <w:tcPr>
+            <w:tcW w:w="6922" w:type="dxa"/>
+            <w:shd w:val="thinDiagCross" w:color="92D050" w:fill="auto"/>
+          </w:tcPr>
+          <w:p>
+            <w:pPr>
+              <w:keepLines/>
+              <w:snapToGrid w:val="0"/>
+              <w:spacing w:before="0" w:after="80" w:line="276" w:lineRule="auto"/>
+            </w:pPr>
+            <w:r>
+              <w:rPr>
+                <w:rFonts w:ascii="宋体" w:hAnsi="宋体" w:eastAsia="宋体"/>
+                <w:sz w:val="21"/>
+                <w:szCs w:val="21"/>
+              </w:rPr>
+              <w:t>UC19 核定退费方案：教务核对实缴金额和已完成训练，给出审核结果及不超过实缴余额的退款额度。</w:t>
+            </w:r>
+          </w:p>
+        </w:tc>
+        <w:tc>
+          <w:tcPr>
+            <w:tcW w:w="477" w:type="dxa"/>
+            <w:shd w:val="clear" w:color="auto" w:fill="FFFFFF" w:themeFill="background1"/>
+          </w:tcPr>
+          <w:p>
+            <w:pPr>
+              <w:spacing w:before="0" w:after="0"/>
+              <w:rPr>
+                <w:szCs w:val="21"/>
+              </w:rPr>
+            </w:pPr>
+          </w:p>
+        </w:tc>
+      </w:tr>
+      <w:tr>
+        <w:tblPrEx>
+          <w:tblBorders>
+            <w:top w:val="single" w:color="auto" w:sz="4" w:space="0"/>
+            <w:left w:val="single" w:color="auto" w:sz="4" w:space="0"/>
+            <w:bottom w:val="single" w:color="auto" w:sz="4" w:space="0"/>
+            <w:right w:val="single" w:color="auto" w:sz="4" w:space="0"/>
+            <w:insideH w:val="single" w:color="auto" w:sz="4" w:space="0"/>
+            <w:insideV w:val="single" w:color="auto" w:sz="4" w:space="0"/>
+          </w:tblBorders>
+          <w:tblCellMar>
+            <w:top w:w="0" w:type="dxa"/>
+            <w:left w:w="108" w:type="dxa"/>
+            <w:bottom w:w="0" w:type="dxa"/>
+            <w:right w:w="108" w:type="dxa"/>
+          </w:tblCellMar>
+        </w:tblPrEx>
+        <w:trPr>
+          <w:cantSplit/>
+        </w:trPr>
+        <w:tc>
+          <w:tcPr>
+            <w:tcW w:w="1123" w:type="dxa"/>
+            <w:vMerge w:val="continue"/>
+            <w:vAlign w:val="center"/>
+          </w:tcPr>
+          <w:p/>
+        </w:tc>
+        <w:tc>
+          <w:tcPr>
+            <w:tcW w:w="6922" w:type="dxa"/>
+            <w:shd w:val="thinDiagCross" w:color="92D050" w:fill="auto"/>
+          </w:tcPr>
+          <w:p>
+            <w:pPr>
+              <w:keepLines/>
+              <w:snapToGrid w:val="0"/>
+              <w:spacing w:before="0" w:after="80" w:line="276" w:lineRule="auto"/>
+            </w:pPr>
+            <w:r>
+              <w:rPr>
+                <w:rFonts w:ascii="宋体" w:hAnsi="宋体" w:eastAsia="宋体"/>
+                <w:sz w:val="21"/>
+                <w:szCs w:val="21"/>
+              </w:rPr>
+              <w:t>UC20 登记退费结果：财务按核定方案登记退款，结算完成后将申请标记为已退款、学籍标记为退学。</w:t>
+            </w:r>
+          </w:p>
+        </w:tc>
+        <w:tc>
+          <w:tcPr>
+            <w:tcW w:w="477" w:type="dxa"/>
+            <w:shd w:val="clear" w:color="auto" w:fill="FFFFFF" w:themeFill="background1"/>
+          </w:tcPr>
+          <w:p>
+            <w:pPr>
+              <w:spacing w:before="0" w:after="0"/>
+              <w:rPr>
+                <w:szCs w:val="21"/>
+              </w:rPr>
+            </w:pPr>
+          </w:p>
+        </w:tc>
+      </w:tr>
+      <w:tr>
+        <w:tblPrEx>
+          <w:tblBorders>
+            <w:top w:val="single" w:color="auto" w:sz="4" w:space="0"/>
+            <w:left w:val="single" w:color="auto" w:sz="4" w:space="0"/>
+            <w:bottom w:val="single" w:color="auto" w:sz="4" w:space="0"/>
+            <w:right w:val="single" w:color="auto" w:sz="4" w:space="0"/>
+            <w:insideH w:val="single" w:color="auto" w:sz="4" w:space="0"/>
+            <w:insideV w:val="single" w:color="auto" w:sz="4" w:space="0"/>
+          </w:tblBorders>
+          <w:tblCellMar>
+            <w:top w:w="0" w:type="dxa"/>
+            <w:left w:w="108" w:type="dxa"/>
+            <w:bottom w:w="0" w:type="dxa"/>
+            <w:right w:w="108" w:type="dxa"/>
+          </w:tblCellMar>
+        </w:tblPrEx>
+        <w:trPr>
+          <w:cantSplit/>
+        </w:trPr>
+        <w:tc>
+          <w:tcPr>
+            <w:tcW w:w="1123" w:type="dxa"/>
+            <w:vMerge w:val="continue"/>
+            <w:vAlign w:val="center"/>
+          </w:tcPr>
+          <w:p/>
+        </w:tc>
+        <w:tc>
+          <w:tcPr>
+            <w:tcW w:w="6922" w:type="dxa"/>
+            <w:shd w:val="thinDiagCross" w:color="92D050" w:fill="auto"/>
+          </w:tcPr>
+          <w:p>
+            <w:pPr>
+              <w:keepLines/>
+              <w:snapToGrid w:val="0"/>
+              <w:spacing w:before="0" w:after="80" w:line="276" w:lineRule="auto"/>
+            </w:pPr>
+            <w:r>
+              <w:rPr>
+                <w:rFonts w:ascii="宋体" w:hAnsi="宋体" w:eastAsia="宋体"/>
+                <w:sz w:val="21"/>
+                <w:szCs w:val="21"/>
+              </w:rPr>
+              <w:t>UC21 查询退学退费记录：学员查看本人申请和退款进度，教务、财务按职责查询处理记录。</w:t>
             </w:r>
           </w:p>
         </w:tc>
@@ -2039,25 +2855,28 @@
             </w:pPr>
             <w:r>
               <w:rPr>
-                <w:rFonts w:ascii="宋体" w:hAnsi="宋体"/>
-                <w:b w:val="0"/>
-                <w:sz w:val="21"/>
-              </w:rPr>
-              <w:t>整体E-R图按模块分幅展示，同名实体表示同一张表。矩形为实体，菱形为联系；N表示多条，0..1表示可无且最多一条。审核、登记等操作人外键见关系模式和SQL。</w:t>
-            </w:r>
-            <w:r>
-              <w:rPr>
-                <w:rFonts w:ascii="宋体" w:hAnsi="宋体" w:eastAsia="宋体"/>
-                <w:b w:val="0"/>
-                <w:sz w:val="21"/>
+                <w:rFonts w:ascii="宋体" w:hAnsi="宋体" w:eastAsia="宋体"/>
+                <w:b w:val="0"/>
+                <w:sz w:val="21"/>
+                <w:szCs w:val="21"/>
+              </w:rPr>
+              <w:t>下图为综合E-R总览，后附各模块详图；同名实体代表同一张表，N表示多条，0..1表示最多一条，操作人外键见关系模式和SQL。</w:t>
+            </w:r>
+            <w:r>
+              <w:rPr>
+                <w:rFonts w:ascii="宋体" w:hAnsi="宋体" w:eastAsia="宋体"/>
+                <w:b w:val="0"/>
+                <w:sz w:val="21"/>
+                <w:szCs w:val="21"/>
               </w:rPr>
               <w:t/>
             </w:r>
             <w:r>
               <w:rPr>
-                <w:rFonts w:ascii="宋体" w:hAnsi="宋体"/>
-                <w:b w:val="0"/>
-                <w:sz w:val="21"/>
+                <w:rFonts w:ascii="宋体" w:hAnsi="宋体" w:eastAsia="宋体"/>
+                <w:b w:val="0"/>
+                <w:sz w:val="21"/>
+                <w:szCs w:val="21"/>
               </w:rPr>
               <w:t/>
             </w:r>
@@ -2066,17 +2885,68 @@
                 <w:rFonts w:ascii="宋体" w:hAnsi="宋体" w:eastAsia="宋体"/>
                 <w:b w:val="0"/>
                 <w:sz w:val="21"/>
+                <w:szCs w:val="21"/>
               </w:rPr>
               <w:t/>
             </w:r>
             <w:r>
               <w:rPr>
-                <w:rFonts w:ascii="宋体" w:hAnsi="宋体"/>
-                <w:b w:val="0"/>
-                <w:sz w:val="21"/>
+                <w:rFonts w:ascii="宋体" w:hAnsi="宋体" w:eastAsia="宋体"/>
+                <w:b w:val="0"/>
+                <w:sz w:val="21"/>
+                <w:szCs w:val="21"/>
               </w:rPr>
               <w:t/>
             </w:r>
+          </w:p>
+          <w:p>
+            <w:pPr>
+              <w:keepLines/>
+              <w:spacing w:before="100" w:after="100" w:line="240" w:lineRule="auto"/>
+              <w:jc w:val="center"/>
+            </w:pPr>
+            <w:bookmarkStart w:id="0" w:name="_GoBack"/>
+            <w:r>
+              <w:drawing>
+                <wp:inline distT="0" distB="0" distL="0" distR="0">
+                  <wp:extent cx="4920615" cy="6723427"/>
+                  <wp:effectExtent l="0" t="0" r="0" b="0"/>
+                  <wp:docPr id="301" name="综合E-R总览" descr="22个实体、23条核心关系；分模块统一展示。"/>
+                  <wp:cNvGraphicFramePr>
+                    <a:graphicFrameLocks xmlns:a="http://schemas.openxmlformats.org/drawingml/2006/main" noChangeAspect="1"/>
+                  </wp:cNvGraphicFramePr>
+                  <a:graphic xmlns:a="http://schemas.openxmlformats.org/drawingml/2006/main">
+                    <a:graphicData uri="http://schemas.openxmlformats.org/drawingml/2006/picture">
+                      <pic:pic xmlns:pic="http://schemas.openxmlformats.org/drawingml/2006/picture">
+                        <pic:nvPicPr>
+                          <pic:cNvPr id="301" name="综合E-R总览" descr="22个实体、23条核心关系；分模块统一展示。"/>
+                          <pic:cNvPicPr>
+                            <a:picLocks noChangeAspect="1" noChangeArrowheads="1"/>
+                          </pic:cNvPicPr>
+                        </pic:nvPicPr>
+                        <pic:blipFill>
+                          <a:blip r:embed="rIdErOverview"/>
+                          <a:stretch>
+                            <a:fillRect/>
+                          </a:stretch>
+                        </pic:blipFill>
+                        <pic:spPr>
+                          <a:xfrm>
+                            <a:off x="0" y="0"/>
+                            <a:ext cx="4920615" cy="6723427"/>
+                          </a:xfrm>
+                          <a:prstGeom prst="rect">
+                            <a:avLst/>
+                          </a:prstGeom>
+                          <a:noFill/>
+                        </pic:spPr>
+                      </pic:pic>
+                    </a:graphicData>
+                  </a:graphic>
+                </wp:inline>
+              </w:drawing>
+            </w:r>
+            <w:bookmarkEnd w:id="0"/>
           </w:p>
           <w:p>
             <w:pPr>
@@ -2419,14 +3289,17 @@
           </w:tcPr>
           <w:p>
             <w:pPr>
-              <w:spacing w:before="0" w:after="60" w:line="276" w:lineRule="auto"/>
+              <w:keepLines/>
+              <w:snapToGrid w:val="0"/>
+              <w:spacing w:after="80" w:line="276" w:lineRule="auto"/>
               <w:jc w:val="left"/>
             </w:pPr>
             <w:r>
               <w:rPr>
-                <w:rFonts w:ascii="宋体" w:hAnsi="宋体"/>
-                <w:b w:val="0"/>
-                <w:sz w:val="18"/>
+                <w:rFonts w:ascii="宋体" w:hAnsi="宋体" w:eastAsia="宋体"/>
+                <w:b w:val="0"/>
+                <w:sz w:val="21"/>
+                <w:szCs w:val="21"/>
               </w:rPr>
               <w:t>数据库关系模式（</w:t>
             </w:r>
@@ -2434,15 +3307,17 @@
               <w:rPr>
                 <w:rFonts w:ascii="宋体" w:hAnsi="宋体" w:eastAsia="宋体"/>
                 <w:b w:val="0"/>
-                <w:sz w:val="18"/>
+                <w:sz w:val="21"/>
+                <w:szCs w:val="21"/>
               </w:rPr>
               <w:t>PK</w:t>
             </w:r>
             <w:r>
               <w:rPr>
-                <w:rFonts w:ascii="宋体" w:hAnsi="宋体"/>
-                <w:b w:val="0"/>
-                <w:sz w:val="18"/>
+                <w:rFonts w:ascii="宋体" w:hAnsi="宋体" w:eastAsia="宋体"/>
+                <w:b w:val="0"/>
+                <w:sz w:val="21"/>
+                <w:szCs w:val="21"/>
               </w:rPr>
               <w:t>为主键，</w:t>
             </w:r>
@@ -2450,301 +3325,369 @@
               <w:rPr>
                 <w:rFonts w:ascii="宋体" w:hAnsi="宋体" w:eastAsia="宋体"/>
                 <w:b w:val="0"/>
-                <w:sz w:val="18"/>
+                <w:sz w:val="21"/>
+                <w:szCs w:val="21"/>
               </w:rPr>
               <w:t>FK</w:t>
             </w:r>
             <w:r>
               <w:rPr>
-                <w:rFonts w:ascii="宋体" w:hAnsi="宋体"/>
-                <w:b w:val="0"/>
-                <w:sz w:val="18"/>
+                <w:rFonts w:ascii="宋体" w:hAnsi="宋体" w:eastAsia="宋体"/>
+                <w:b w:val="0"/>
+                <w:sz w:val="21"/>
+                <w:szCs w:val="21"/>
               </w:rPr>
               <w:t>为外键）：</w:t>
             </w:r>
           </w:p>
           <w:p>
             <w:pPr>
-              <w:spacing w:before="0" w:after="60" w:line="276" w:lineRule="auto"/>
-            </w:pPr>
-            <w:r>
-              <w:rPr>
-                <w:rFonts w:ascii="宋体" w:hAnsi="宋体" w:eastAsia="宋体"/>
-                <w:b w:val="0"/>
-                <w:sz w:val="18"/>
+              <w:keepLines/>
+              <w:snapToGrid w:val="0"/>
+              <w:spacing w:after="80" w:line="276" w:lineRule="auto"/>
+            </w:pPr>
+            <w:r>
+              <w:rPr>
+                <w:rFonts w:ascii="宋体" w:hAnsi="宋体" w:eastAsia="宋体"/>
+                <w:b w:val="0"/>
+                <w:sz w:val="21"/>
+                <w:szCs w:val="21"/>
               </w:rPr>
               <w:t>1. user_account(user_id PK, username, password_hash, real_name, phone, account_status, created_at)</w:t>
             </w:r>
           </w:p>
           <w:p>
             <w:pPr>
-              <w:spacing w:before="0" w:after="60" w:line="276" w:lineRule="auto"/>
-            </w:pPr>
-            <w:r>
-              <w:rPr>
-                <w:rFonts w:ascii="宋体" w:hAnsi="宋体" w:eastAsia="宋体"/>
-                <w:b w:val="0"/>
-                <w:sz w:val="18"/>
+              <w:keepLines/>
+              <w:snapToGrid w:val="0"/>
+              <w:spacing w:after="80" w:line="276" w:lineRule="auto"/>
+            </w:pPr>
+            <w:r>
+              <w:rPr>
+                <w:rFonts w:ascii="宋体" w:hAnsi="宋体" w:eastAsia="宋体"/>
+                <w:b w:val="0"/>
+                <w:sz w:val="21"/>
+                <w:szCs w:val="21"/>
               </w:rPr>
               <w:t>2. role(role_id PK, role_code, role_name, description)</w:t>
             </w:r>
           </w:p>
           <w:p>
             <w:pPr>
-              <w:spacing w:before="0" w:after="60" w:line="276" w:lineRule="auto"/>
-            </w:pPr>
-            <w:r>
-              <w:rPr>
-                <w:rFonts w:ascii="宋体" w:hAnsi="宋体" w:eastAsia="宋体"/>
-                <w:b w:val="0"/>
-                <w:sz w:val="18"/>
+              <w:keepLines/>
+              <w:snapToGrid w:val="0"/>
+              <w:spacing w:after="80" w:line="276" w:lineRule="auto"/>
+            </w:pPr>
+            <w:r>
+              <w:rPr>
+                <w:rFonts w:ascii="宋体" w:hAnsi="宋体" w:eastAsia="宋体"/>
+                <w:b w:val="0"/>
+                <w:sz w:val="21"/>
+                <w:szCs w:val="21"/>
               </w:rPr>
               <w:t>3. user_role(user_id PK/FK, role_id PK/FK, assigned_at)</w:t>
             </w:r>
           </w:p>
           <w:p>
             <w:pPr>
-              <w:spacing w:before="0" w:after="60" w:line="276" w:lineRule="auto"/>
-            </w:pPr>
-            <w:r>
-              <w:rPr>
-                <w:rFonts w:ascii="宋体" w:hAnsi="宋体" w:eastAsia="宋体"/>
-                <w:b w:val="0"/>
-                <w:sz w:val="18"/>
+              <w:keepLines/>
+              <w:snapToGrid w:val="0"/>
+              <w:spacing w:after="80" w:line="276" w:lineRule="auto"/>
+            </w:pPr>
+            <w:r>
+              <w:rPr>
+                <w:rFonts w:ascii="宋体" w:hAnsi="宋体" w:eastAsia="宋体"/>
+                <w:b w:val="0"/>
+                <w:sz w:val="21"/>
+                <w:szCs w:val="21"/>
               </w:rPr>
               <w:t>4. menu(menu_id PK, menu_code, menu_name, menu_path, sort_no, enabled)</w:t>
             </w:r>
           </w:p>
           <w:p>
             <w:pPr>
-              <w:spacing w:before="0" w:after="60" w:line="276" w:lineRule="auto"/>
-            </w:pPr>
-            <w:r>
-              <w:rPr>
-                <w:rFonts w:ascii="宋体" w:hAnsi="宋体" w:eastAsia="宋体"/>
-                <w:b w:val="0"/>
-                <w:sz w:val="18"/>
+              <w:keepLines/>
+              <w:snapToGrid w:val="0"/>
+              <w:spacing w:after="80" w:line="276" w:lineRule="auto"/>
+            </w:pPr>
+            <w:r>
+              <w:rPr>
+                <w:rFonts w:ascii="宋体" w:hAnsi="宋体" w:eastAsia="宋体"/>
+                <w:b w:val="0"/>
+                <w:sz w:val="21"/>
+                <w:szCs w:val="21"/>
               </w:rPr>
               <w:t>5. role_menu(role_id PK/FK, menu_id PK/FK)</w:t>
             </w:r>
           </w:p>
           <w:p>
             <w:pPr>
-              <w:spacing w:before="0" w:after="60" w:line="276" w:lineRule="auto"/>
-            </w:pPr>
-            <w:r>
-              <w:rPr>
-                <w:rFonts w:ascii="宋体" w:hAnsi="宋体" w:eastAsia="宋体"/>
-                <w:b w:val="0"/>
-                <w:sz w:val="18"/>
+              <w:keepLines/>
+              <w:snapToGrid w:val="0"/>
+              <w:spacing w:after="80" w:line="276" w:lineRule="auto"/>
+            </w:pPr>
+            <w:r>
+              <w:rPr>
+                <w:rFonts w:ascii="宋体" w:hAnsi="宋体" w:eastAsia="宋体"/>
+                <w:b w:val="0"/>
+                <w:sz w:val="21"/>
+                <w:szCs w:val="21"/>
               </w:rPr>
               <w:t>6. student_profile(student_id PK, user_id FK, id_card_no, gender, birth_date, enrollment_status, created_at)</w:t>
             </w:r>
           </w:p>
           <w:p>
             <w:pPr>
-              <w:spacing w:before="0" w:after="60" w:line="276" w:lineRule="auto"/>
-            </w:pPr>
-            <w:r>
-              <w:rPr>
-                <w:rFonts w:ascii="宋体" w:hAnsi="宋体" w:eastAsia="宋体"/>
-                <w:b w:val="0"/>
-                <w:sz w:val="18"/>
+              <w:keepLines/>
+              <w:snapToGrid w:val="0"/>
+              <w:spacing w:after="80" w:line="276" w:lineRule="auto"/>
+            </w:pPr>
+            <w:r>
+              <w:rPr>
+                <w:rFonts w:ascii="宋体" w:hAnsi="宋体" w:eastAsia="宋体"/>
+                <w:b w:val="0"/>
+                <w:sz w:val="21"/>
+                <w:szCs w:val="21"/>
               </w:rPr>
               <w:t>7. coach_profile(coach_id PK, user_id FK, coach_no, license_type, employment_status)</w:t>
             </w:r>
           </w:p>
           <w:p>
             <w:pPr>
-              <w:spacing w:before="0" w:after="60" w:line="276" w:lineRule="auto"/>
-            </w:pPr>
-            <w:r>
-              <w:rPr>
-                <w:rFonts w:ascii="宋体" w:hAnsi="宋体" w:eastAsia="宋体"/>
-                <w:b w:val="0"/>
-                <w:sz w:val="18"/>
+              <w:keepLines/>
+              <w:snapToGrid w:val="0"/>
+              <w:spacing w:after="80" w:line="276" w:lineRule="auto"/>
+            </w:pPr>
+            <w:r>
+              <w:rPr>
+                <w:rFonts w:ascii="宋体" w:hAnsi="宋体" w:eastAsia="宋体"/>
+                <w:b w:val="0"/>
+                <w:sz w:val="21"/>
+                <w:szCs w:val="21"/>
               </w:rPr>
               <w:t>8. training_vehicle(vehicle_id PK, plate_no, vehicle_model, license_type, vehicle_status)</w:t>
             </w:r>
           </w:p>
           <w:p>
             <w:pPr>
-              <w:spacing w:before="0" w:after="60" w:line="276" w:lineRule="auto"/>
-            </w:pPr>
-            <w:r>
-              <w:rPr>
-                <w:rFonts w:ascii="宋体" w:hAnsi="宋体" w:eastAsia="宋体"/>
-                <w:b w:val="0"/>
-                <w:sz w:val="18"/>
+              <w:keepLines/>
+              <w:snapToGrid w:val="0"/>
+              <w:spacing w:after="80" w:line="276" w:lineRule="auto"/>
+            </w:pPr>
+            <w:r>
+              <w:rPr>
+                <w:rFonts w:ascii="宋体" w:hAnsi="宋体" w:eastAsia="宋体"/>
+                <w:b w:val="0"/>
+                <w:sz w:val="21"/>
+                <w:szCs w:val="21"/>
               </w:rPr>
               <w:t>9. training_package(package_id PK, package_code, package_name, price, planned_hours, enabled)</w:t>
             </w:r>
           </w:p>
           <w:p>
             <w:pPr>
-              <w:spacing w:before="0" w:after="60" w:line="276" w:lineRule="auto"/>
-            </w:pPr>
-            <w:r>
-              <w:rPr>
-                <w:rFonts w:ascii="宋体" w:hAnsi="宋体" w:eastAsia="宋体"/>
-                <w:b w:val="0"/>
-                <w:sz w:val="18"/>
-              </w:rPr>
-              <w:t>10. enrollment(enrollment_id PK, student_id FK, package_id FK, status, reviewed_by FK, reviewed_at, review_note, required_amount, active_at)</w:t>
-            </w:r>
-          </w:p>
-          <w:p>
-            <w:pPr>
-              <w:spacing w:before="0" w:after="60" w:line="276" w:lineRule="auto"/>
-            </w:pPr>
-            <w:r>
-              <w:rPr>
-                <w:rFonts w:ascii="宋体" w:hAnsi="宋体" w:eastAsia="宋体"/>
-                <w:b w:val="0"/>
-                <w:sz w:val="18"/>
+              <w:keepLines/>
+              <w:snapToGrid w:val="0"/>
+              <w:spacing w:after="80" w:line="276" w:lineRule="auto"/>
+            </w:pPr>
+            <w:r>
+              <w:rPr>
+                <w:rFonts w:ascii="宋体" w:hAnsi="宋体" w:eastAsia="宋体"/>
+                <w:b w:val="0"/>
+                <w:sz w:val="21"/>
+                <w:szCs w:val="21"/>
+              </w:rPr>
+              <w:t>10. enrollment(enrollment_id PK, student_id FK, package_id FK, submitted_at, status, reviewed_by FK, reviewed_at, review_note, required_amount, active_at)</w:t>
+            </w:r>
+          </w:p>
+          <w:p>
+            <w:pPr>
+              <w:keepLines/>
+              <w:snapToGrid w:val="0"/>
+              <w:spacing w:after="80" w:line="276" w:lineRule="auto"/>
+            </w:pPr>
+            <w:r>
+              <w:rPr>
+                <w:rFonts w:ascii="宋体" w:hAnsi="宋体" w:eastAsia="宋体"/>
+                <w:b w:val="0"/>
+                <w:sz w:val="21"/>
+                <w:szCs w:val="21"/>
               </w:rPr>
               <w:t>11. payment_record(payment_id PK, enrollment_id FK, received_by FK, payment_amount, payment_method, voucher_no, paid_at, payment_status)</w:t>
             </w:r>
           </w:p>
           <w:p>
             <w:pPr>
-              <w:spacing w:before="0" w:after="60" w:line="276" w:lineRule="auto"/>
-            </w:pPr>
-            <w:r>
-              <w:rPr>
-                <w:rFonts w:ascii="宋体" w:hAnsi="宋体" w:eastAsia="宋体"/>
-                <w:b w:val="0"/>
-                <w:sz w:val="18"/>
+              <w:keepLines/>
+              <w:snapToGrid w:val="0"/>
+              <w:spacing w:after="80" w:line="276" w:lineRule="auto"/>
+            </w:pPr>
+            <w:r>
+              <w:rPr>
+                <w:rFonts w:ascii="宋体" w:hAnsi="宋体" w:eastAsia="宋体"/>
+                <w:b w:val="0"/>
+                <w:sz w:val="21"/>
+                <w:szCs w:val="21"/>
               </w:rPr>
               <w:t>12. training_slot(slot_id PK, slot_start, slot_end, location, capacity, slot_status, created_by FK)</w:t>
             </w:r>
           </w:p>
           <w:p>
             <w:pPr>
-              <w:spacing w:before="0" w:after="60" w:line="276" w:lineRule="auto"/>
-            </w:pPr>
-            <w:r>
-              <w:rPr>
-                <w:rFonts w:ascii="宋体" w:hAnsi="宋体" w:eastAsia="宋体"/>
-                <w:b w:val="0"/>
-                <w:sz w:val="18"/>
+              <w:keepLines/>
+              <w:snapToGrid w:val="0"/>
+              <w:spacing w:after="80" w:line="276" w:lineRule="auto"/>
+            </w:pPr>
+            <w:r>
+              <w:rPr>
+                <w:rFonts w:ascii="宋体" w:hAnsi="宋体" w:eastAsia="宋体"/>
+                <w:b w:val="0"/>
+                <w:sz w:val="21"/>
+                <w:szCs w:val="21"/>
               </w:rPr>
               <w:t>13. training_booking(booking_id PK, student_id FK, slot_id FK, booking_status, requested_at, cancelled_at, cancel_reason)</w:t>
             </w:r>
           </w:p>
           <w:p>
             <w:pPr>
-              <w:spacing w:before="0" w:after="60" w:line="276" w:lineRule="auto"/>
-            </w:pPr>
-            <w:r>
-              <w:rPr>
-                <w:rFonts w:ascii="宋体" w:hAnsi="宋体" w:eastAsia="宋体"/>
-                <w:b w:val="0"/>
-                <w:sz w:val="18"/>
+              <w:keepLines/>
+              <w:snapToGrid w:val="0"/>
+              <w:spacing w:after="80" w:line="276" w:lineRule="auto"/>
+            </w:pPr>
+            <w:r>
+              <w:rPr>
+                <w:rFonts w:ascii="宋体" w:hAnsi="宋体" w:eastAsia="宋体"/>
+                <w:b w:val="0"/>
+                <w:sz w:val="21"/>
+                <w:szCs w:val="21"/>
               </w:rPr>
               <w:t>14. training_assignment(assignment_id PK, booking_id FK, coach_id FK, vehicle_id FK, assigned_by FK, assigned_at, assignment_status)</w:t>
             </w:r>
           </w:p>
           <w:p>
             <w:pPr>
-              <w:spacing w:before="0" w:after="60" w:line="276" w:lineRule="auto"/>
-            </w:pPr>
-            <w:r>
-              <w:rPr>
-                <w:rFonts w:ascii="宋体" w:hAnsi="宋体" w:eastAsia="宋体"/>
-                <w:b w:val="0"/>
-                <w:sz w:val="18"/>
+              <w:keepLines/>
+              <w:snapToGrid w:val="0"/>
+              <w:spacing w:after="80" w:line="276" w:lineRule="auto"/>
+            </w:pPr>
+            <w:r>
+              <w:rPr>
+                <w:rFonts w:ascii="宋体" w:hAnsi="宋体" w:eastAsia="宋体"/>
+                <w:b w:val="0"/>
+                <w:sz w:val="21"/>
+                <w:szCs w:val="21"/>
               </w:rPr>
               <w:t>15. training_record(record_id PK, assignment_id FK, recorded_by FK, actual_start, actual_end, valid_hours, record_status, remark)</w:t>
             </w:r>
           </w:p>
           <w:p>
             <w:pPr>
-              <w:spacing w:before="0" w:after="60" w:line="276" w:lineRule="auto"/>
-            </w:pPr>
-            <w:r>
-              <w:rPr>
-                <w:rFonts w:ascii="宋体" w:hAnsi="宋体" w:eastAsia="宋体"/>
-                <w:b w:val="0"/>
-                <w:sz w:val="18"/>
+              <w:keepLines/>
+              <w:snapToGrid w:val="0"/>
+              <w:spacing w:after="80" w:line="276" w:lineRule="auto"/>
+            </w:pPr>
+            <w:r>
+              <w:rPr>
+                <w:rFonts w:ascii="宋体" w:hAnsi="宋体" w:eastAsia="宋体"/>
+                <w:b w:val="0"/>
+                <w:sz w:val="21"/>
+                <w:szCs w:val="21"/>
               </w:rPr>
               <w:t>16. question_bank(question_id PK, category, stem, option_a, option_b, option_c, option_d, correct_option, explanation, enabled, created_by FK, created_at)</w:t>
             </w:r>
           </w:p>
           <w:p>
             <w:pPr>
-              <w:spacing w:before="0" w:after="60" w:line="276" w:lineRule="auto"/>
-            </w:pPr>
-            <w:r>
-              <w:rPr>
-                <w:rFonts w:ascii="宋体" w:hAnsi="宋体" w:eastAsia="宋体"/>
-                <w:b w:val="0"/>
-                <w:sz w:val="18"/>
+              <w:keepLines/>
+              <w:snapToGrid w:val="0"/>
+              <w:spacing w:after="80" w:line="276" w:lineRule="auto"/>
+            </w:pPr>
+            <w:r>
+              <w:rPr>
+                <w:rFonts w:ascii="宋体" w:hAnsi="宋体" w:eastAsia="宋体"/>
+                <w:b w:val="0"/>
+                <w:sz w:val="21"/>
+                <w:szCs w:val="21"/>
               </w:rPr>
               <w:t>17. mock_exam(exam_id PK, exam_name, question_count, duration_minutes, pass_score, status, submitted_by FK, reviewed_by FK, reviewed_at, review_note, published_at)</w:t>
             </w:r>
           </w:p>
           <w:p>
             <w:pPr>
-              <w:spacing w:before="0" w:after="60" w:line="276" w:lineRule="auto"/>
-            </w:pPr>
-            <w:r>
-              <w:rPr>
-                <w:rFonts w:ascii="宋体" w:hAnsi="宋体" w:eastAsia="宋体"/>
-                <w:b w:val="0"/>
-                <w:sz w:val="18"/>
+              <w:keepLines/>
+              <w:snapToGrid w:val="0"/>
+              <w:spacing w:after="80" w:line="276" w:lineRule="auto"/>
+            </w:pPr>
+            <w:r>
+              <w:rPr>
+                <w:rFonts w:ascii="宋体" w:hAnsi="宋体" w:eastAsia="宋体"/>
+                <w:b w:val="0"/>
+                <w:sz w:val="21"/>
+                <w:szCs w:val="21"/>
               </w:rPr>
               <w:t>18. mock_exam_question(exam_question_id PK, exam_id FK, question_id FK, position_no, stem_snapshot, option_a_snapshot, option_b_snapshot, option_c_snapshot, option_d_snapshot, correct_option_snapshot, explanation_snapshot)</w:t>
             </w:r>
           </w:p>
           <w:p>
             <w:pPr>
-              <w:spacing w:before="0" w:after="60" w:line="276" w:lineRule="auto"/>
-            </w:pPr>
-            <w:r>
-              <w:rPr>
-                <w:rFonts w:ascii="宋体" w:hAnsi="宋体" w:eastAsia="宋体"/>
-                <w:b w:val="0"/>
-                <w:sz w:val="18"/>
+              <w:keepLines/>
+              <w:snapToGrid w:val="0"/>
+              <w:spacing w:after="80" w:line="276" w:lineRule="auto"/>
+            </w:pPr>
+            <w:r>
+              <w:rPr>
+                <w:rFonts w:ascii="宋体" w:hAnsi="宋体" w:eastAsia="宋体"/>
+                <w:b w:val="0"/>
+                <w:sz w:val="21"/>
+                <w:szCs w:val="21"/>
               </w:rPr>
               <w:t>19. exam_attempt(attempt_id PK, exam_id FK, student_id FK, attempt_status, started_at, deadline_at, submitted_at, score, correct_count, passed)</w:t>
             </w:r>
           </w:p>
           <w:p>
             <w:pPr>
-              <w:spacing w:before="0" w:after="60" w:line="276" w:lineRule="auto"/>
-            </w:pPr>
-            <w:r>
-              <w:rPr>
-                <w:rFonts w:ascii="宋体" w:hAnsi="宋体" w:eastAsia="宋体"/>
-                <w:b w:val="0"/>
-                <w:sz w:val="18"/>
+              <w:keepLines/>
+              <w:snapToGrid w:val="0"/>
+              <w:spacing w:after="80" w:line="276" w:lineRule="auto"/>
+            </w:pPr>
+            <w:r>
+              <w:rPr>
+                <w:rFonts w:ascii="宋体" w:hAnsi="宋体" w:eastAsia="宋体"/>
+                <w:b w:val="0"/>
+                <w:sz w:val="21"/>
+                <w:szCs w:val="21"/>
               </w:rPr>
               <w:t>20. exam_attempt_answer(answer_id PK, attempt_id FK, exam_question_id FK, selected_option, is_correct, score_awarded, answered_at)</w:t>
             </w:r>
           </w:p>
           <w:p>
             <w:pPr>
-              <w:spacing w:before="0" w:after="60" w:line="276" w:lineRule="auto"/>
-            </w:pPr>
-            <w:r>
-              <w:rPr>
-                <w:rFonts w:ascii="宋体" w:hAnsi="宋体" w:eastAsia="宋体"/>
-                <w:b w:val="0"/>
-                <w:sz w:val="18"/>
+              <w:keepLines/>
+              <w:snapToGrid w:val="0"/>
+              <w:spacing w:after="80" w:line="276" w:lineRule="auto"/>
+            </w:pPr>
+            <w:r>
+              <w:rPr>
+                <w:rFonts w:ascii="宋体" w:hAnsi="宋体" w:eastAsia="宋体"/>
+                <w:b w:val="0"/>
+                <w:sz w:val="21"/>
+                <w:szCs w:val="21"/>
               </w:rPr>
               <w:t>21. withdrawal_request(withdrawal_id PK, student_id FK, reason, requested_at, status, reviewed_by FK, reviewed_at, review_note, approved_refund_amount)</w:t>
             </w:r>
           </w:p>
           <w:p>
             <w:pPr>
-              <w:spacing w:before="0" w:after="60" w:line="276" w:lineRule="auto"/>
-            </w:pPr>
-            <w:r>
-              <w:rPr>
-                <w:rFonts w:ascii="宋体" w:hAnsi="宋体" w:eastAsia="宋体"/>
-                <w:b w:val="0"/>
-                <w:sz w:val="18"/>
+              <w:keepLines/>
+              <w:snapToGrid w:val="0"/>
+              <w:spacing w:after="80" w:line="276" w:lineRule="auto"/>
+            </w:pPr>
+            <w:r>
+              <w:rPr>
+                <w:rFonts w:ascii="宋体" w:hAnsi="宋体" w:eastAsia="宋体"/>
+                <w:b w:val="0"/>
+                <w:sz w:val="21"/>
+                <w:szCs w:val="21"/>
               </w:rPr>
               <w:t>22. refund_record(refund_id PK, withdrawal_id FK, paid_by FK, refund_amount, refund_method, voucher_no, refunded_at, refund_status)</w:t>
             </w:r>

</xml_diff>